<commit_message>
Documentatie: adauga ultimele modificari din Comenzi (sinecost, Coef., latime, scroll dinamic)
Completeaza documentatia tehnica si manualul de utilizare cu modificarile
mai mici livrate dupa ultima actualizare majora (persistenta): eticheta
"sinecost: ..." eliminata de sub numele produsului, campul Coef. largit,
latimea maxima a aplicatiei crescuta la 2000px (cu nota despre trucul CSS
abandonat), si mecanismul fitTableWrapHeight extins acum si la scroll,
aplicat si tabelului de preturi din Comenzi.

Co-Authored-By: Claude Sonnet 5 <noreply@anthropic.com>
</commit_message>
<xml_diff>
--- a/Panou achizitii - documentatie tehnica.docx
+++ b/Panou achizitii - documentatie tehnica.docx
@@ -17,7 +17,7 @@
     </w:p>
     <w:p>
       <w:r>
-        <w:t>Actualizat: 2026-10-02, cu persistența redesenată complet (produsele, comenzile și listele de preț au acum propriile tabele în Supabase, cu salvare pe bucăți — vezi secțiunea 5), o reparație critică la limitarea de rată MoySklad (care dezactivase temporar accesul API pentru tot contul), corectarea a două bug-uri grave la prețurile Secundar/Pachet 1-3 din Comenzi (reveneau silențios la valori vechi), protecție la pierderea modificărilor dintr-un refresh rapid (Ctrl+F5), sincronizare automată a catalogului MoySklad la pornire, afișarea stocului MoySklad direct în Comenzi, și corectări de căutare/redimensionare în Comparație produse.</w:t>
+        <w:t>Actualizat: 2026-10-02, cu persistența redesenată complet (produsele, comenzile și listele de preț au acum propriile tabele în Supabase, cu salvare pe bucăți — vezi secțiunea 5), o reparație critică la limitarea de rată MoySklad (care dezactivase temporar accesul API pentru tot contul), corectarea a două bug-uri grave la prețurile Secundar/Pachet 1-3 din Comenzi (reveneau silențios la valori vechi), protecție la pierderea modificărilor dintr-un refresh rapid (Ctrl+F5), sincronizare automată a catalogului MoySklad la pornire, afișarea stocului MoySklad direct în Comenzi, și corectări de căutare/redimensionare în Comparație produse. De asemenea: eticheta de rutină „sinecost: ..." eliminată din Comenzi, tabelele cu scroll (inclusiv tabelul de prețuri din Comenzi) care se extind acum dinamic pe măsură ce derulezi pagina, și lățimea maximă a aplicației mărită la 2000px.</w:t>
       </w:r>
     </w:p>
     <w:p>
@@ -1474,6 +1474,22 @@
     </w:p>
     <w:p>
       <w:pPr>
+        <w:pStyle w:val="ListBullet"/>
+      </w:pPr>
+      <w:r>
+        <w:t>Eticheta de rutină „sinecost: [sursă]" de sub numele produsului a fost eliminată (aglomera celula, fără folos practic) — rămâne doar avertismentul „fără cost cunoscut", afișat roșu, cînd chiar lipsește o sursă de preț pentru produs.</w:t>
+      </w:r>
+    </w:p>
+    <w:p>
+      <w:pPr>
+        <w:pStyle w:val="ListBullet"/>
+      </w:pPr>
+      <w:r>
+        <w:t>Câmpul „Coef." din antetul comenzii deschise a fost lărgit ușor (80px → 95px) — era prea strâmt pentru o valoare cu virgulă zecimală.</w:t>
+      </w:r>
+    </w:p>
+    <w:p>
+      <w:pPr>
         <w:pStyle w:val="Heading3"/>
       </w:pPr>
       <w:r>
@@ -1880,6 +1896,22 @@
     </w:p>
     <w:p>
       <w:pPr>
+        <w:pStyle w:val="ListBullet"/>
+      </w:pPr>
+      <w:r>
+        <w:t>Lățimea maximă a conținutului (clasa .wrap din CSS) a crescut de la 1600px la 2000px — afectează toate tab-urile uniform, nu doar un panou anume; gândită ca variantă mai simplă și mai sigură decît un truc CSS anterior, scos din uz (vezi secțiunea 10).</w:t>
+      </w:r>
+    </w:p>
+    <w:p>
+      <w:pPr>
+        <w:pStyle w:val="ListBullet"/>
+      </w:pPr>
+      <w:r>
+        <w:t>fitTableWrapHeight (index.html) calculează dinamic înălțimea disponibilă a unui .table-wrap, din poziția lui față de baza ferestrei (window.innerHeight - top - 8px) — recalculată acum și la evenimentul scroll al paginii (throttled prin requestAnimationFrame), nu doar la resize. Tabelul de prețuri din Comenzi avea până acum o excepție fixă (clasa table-wrap-fixed), tocmai pentru că recalcularea nu rula la scroll și rămânea „înghețată" la poziția de la randare („cînd prea mare, cînd prea mică") — cu recalcularea pe scroll adăugată, excepția nu mai e necesară, iar tabelul din Comenzi folosește acum același mecanism dinamic ca Comparație produse/Catalog.</w:t>
+      </w:r>
+    </w:p>
+    <w:p>
+      <w:pPr>
         <w:pStyle w:val="Heading1"/>
       </w:pPr>
       <w:r>
@@ -2028,6 +2060,14 @@
       </w:pPr>
       <w:r>
         <w:t>O confirmare de import (sau orice altă modificare) se putea pierde silențios la un refresh rapid (Ctrl+F5), dacă utilizatorul ieșea din pagină înainte ca salvarea către Supabase să apuce să se confirme — raportat concret: import de listă de preț confirmat, apoi Ctrl+F5 imediat, iar la reîncărcare importul arăta din nou „neimportat încă". sendBeacon, singura metodă cu adevărat garantată să supraviețuiască unui unload, e plafonată la ~64KB, mult sub mărimea reală a stării aplicației. Reparat cu un flag saveInProgress care rămâne activ din momentul în care o modificare e pusă în coadă până când salvarea chiar se confirmă (succes sau eșec final, după reîncercări) — beforeunload arată acum avertismentul nativ al browserului („modificările ar putea să nu fie salvate") cât timp o salvare e în desfășurare, ca utilizatorul să poată aștepta în loc să piardă tăcut o editare. După redesign-ul persistenței (secțiunea 5), flagul rămâne activ pe parcursul ÎNTREGII secvențe de cereri ale unei salvări, nu doar pe durata primei.</w:t>
+      </w:r>
+    </w:p>
+    <w:p>
+      <w:pPr>
+        <w:pStyle w:val="ListBullet"/>
+      </w:pPr>
+      <w:r>
+        <w:t>O primă variantă pentru lărgirea panoului comenzii deschise a folosit un „breakout" CSS (width:100vw + margini negative), aplicat doar pe acel panou, ca să nu atingă restul aplicației — a produs însă un artefact vizual lângă antetul fix al tabelului (un tabel gol/dublat, aparent „rămas în spate"), din cauza interacțiunii cu mecanismul propriu de ghost header sticky (secțiunea 9). Revenit la soluția mai simplă din secțiunea 9 (lățimea globală .wrap, 1600px → 2000px) — risc mult mai mic, cu prețul că afectează toate tab-urile, nu doar unul.</w:t>
       </w:r>
     </w:p>
     <w:p>

</xml_diff>

<commit_message>
Documentație: duplicate MoySklad, sincronizare automată înainte de trimitere/import
Documentația tehnică: secțiuni noi în §6 (detectarea duplicatelor și protecția
la scriere; sincronizarea automată a catalogului), §7.4/§7.5 (comportamentul
din Comenzi), §8, două intrări noi în §10 (scrieri pe produsul greșit din cauza
indexului last-wins; butoanele moarte din Produse MoySklad), §11-12 corectate.
Manual de utilizare: cum verifici duplicatele, ce înseamnă "⚠ barcode duplicat",
că Importă/Trimite sincronizează singure catalogul, 2 rânduri noi în depanare.

Co-Authored-By: Claude Sonnet 5.5 <noreply@anthropic.com>
</commit_message>
<xml_diff>
--- a/Panou achizitii - documentatie tehnica.docx
+++ b/Panou achizitii - documentatie tehnica.docx
@@ -17,7 +17,7 @@
     </w:p>
     <w:p>
       <w:r>
-        <w:t>Actualizat: 2026-10-02, cu persistența redesenată complet (produsele, comenzile și listele de preț au acum propriile tabele în Supabase, cu salvare pe bucăți — vezi secțiunea 5), o reparație critică la limitarea de rată MoySklad (care dezactivase temporar accesul API pentru tot contul), corectarea a două bug-uri grave la prețurile Secundar/Pachet 1-3 din Comenzi (reveneau silențios la valori vechi), protecție la pierderea modificărilor dintr-un refresh rapid (Ctrl+F5), sincronizare automată a catalogului MoySklad la pornire, afișarea stocului MoySklad direct în Comenzi, și corectări de căutare/redimensionare în Comparație produse. De asemenea: eticheta de rutină „sinecost: ..." eliminată din Comenzi, tabelele cu scroll (inclusiv tabelul de prețuri din Comenzi) care se extind acum dinamic pe măsură ce derulezi pagina, și lățimea maximă a aplicației mărită la 2000px.</w:t>
+        <w:t>Actualizat: 2026-10-06, cu detectarea produselor MoySklad duplicate și protecția împotriva scrierii prețurilor pe produsul greșit (importul/trimiterea de prețuri sar peste barcode-urile duplicate, iar tab-ul Produse MoySklad are un raport „Verifică duplicate"), sincronizarea automată a catalogului MoySklad înainte de fiecare import/trimitere de prețuri, și repararea butoanelor „Arhivate" / „Înapoi la branduri" / „Arhivate în acest brand" din Produse MoySklad, care nu făceau nimic. Actualizarea anterioară (2026-10-02) adusese: persistența redesenată complet (produsele, comenzile și listele de preț au acum propriile tabele în Supabase, cu salvare pe bucăți — vezi secțiunea 5), o reparație critică la limitarea de rată MoySklad (care dezactivase temporar accesul API pentru tot contul), corectarea a două bug-uri grave la prețurile Secundar/Pachet 1-3 din Comenzi (reveneau silențios la valori vechi), protecție la pierderea modificărilor dintr-un refresh rapid (Ctrl+F5), sincronizare automată a catalogului MoySklad la pornire, afișarea stocului MoySklad direct în Comenzi, și corectări de căutare/redimensionare în Comparație produse. De asemenea: eticheta de rutină „sinecost: ..." eliminată din Comenzi, tabelele cu scroll (inclusiv tabelul de prețuri din Comenzi) care se extind acum dinamic pe măsură ce derulezi pagina, și lățimea maximă a aplicației mărită la 2000px.</w:t>
       </w:r>
     </w:p>
     <w:p>
@@ -1020,6 +1020,122 @@
         <w:pStyle w:val="Heading3"/>
       </w:pPr>
       <w:r>
+        <w:t>Produse MoySklad duplicate — detectare și protecție la scriere</w:t>
+      </w:r>
+    </w:p>
+    <w:p>
+      <w:pPr/>
+      <w:r>
+        <w:t>Dacă același produs a fost introdus de două ori în MoySklad (același barcode și/sau același cod), aplicația nu are de unde să știe la care dintre ele să scrie sau de la care să citească prețurile. Înainte de această reparație alegea însă tăcut unul dintre ele, fără niciun semnal către utilizator (vezi și secțiunea 10).</w:t>
+      </w:r>
+    </w:p>
+    <w:p>
+      <w:pPr>
+        <w:pStyle w:val="ListBullet"/>
+      </w:pPr>
+      <w:r>
+        <w:t>Cauza: rebuildMoyskladIndex() construia doar moyskladByBarcode — un dicționar barcode → UN singur produs MoySklad, în care ultimul produs întâlnit în catalog câștiga. La un barcode duplicat, moyskladLookup() întorcea deci tăcut unul din cele două produse, iar importul/trimiterea de prețuri scriau pe el, uneori pe cel greșit.</w:t>
+      </w:r>
+    </w:p>
+    <w:p>
+      <w:pPr>
+        <w:pStyle w:val="ListBullet"/>
+      </w:pPr>
+      <w:r>
+        <w:t>Indexul complet: rebuildMoyskladIndex() construiește acum în plus moyskladAllByBarcode (barcode → toate produsele MoySklad distincte care îl au) și apelează findCatalogDuplicates(), al cărei rezultat e păstrat în catalogDuplicateGroups. findCatalogDuplicates() grupează produsele care au același barcode SAU același cod; o pereche de produse care se potrivește pe ambele apare o singură dată, cu ambele motive. Același barcode repetat pe un singur produs NU e duplicat.</w:t>
+      </w:r>
+    </w:p>
+    <w:p>
+      <w:pPr>
+        <w:pStyle w:val="ListBullet"/>
+      </w:pPr>
+      <w:r>
+        <w:t>Potrivire ambiguă: moyskladMatches(p) întoarce toate produsele MoySklad pentru barcode-ul pe care l-ar folosi moyskladLookup (întâi barcode-ul principal, apoi cele alternative) — mai mult de unul înseamnă potrivire ambiguă. moyskladLookup și moyskladByBarcode au rămas neschimbate (stoc, poze, istoric le folosesc ca înainte); doar importul/trimiterea de prețuri și avertismentul din tabelul comenzii verifică ambiguitatea.</w:t>
+      </w:r>
+    </w:p>
+    <w:p>
+      <w:pPr>
+        <w:pStyle w:val="ListBullet"/>
+      </w:pPr>
+      <w:r>
+        <w:t>Raportul din interfață (tab-ul Produse MoySklad, secțiunea 8): butonul „Verifică duplicate" din bara de sus arată numărul de grupuri (roșu, cu ⚠) sau „✓ Fără duplicate" și deschide raportul — câte un card per grup, cu motivul („același barcode … și același cod …") și, pentru fiecare produs MoySklad, numele, brandul, codul, articolul, barcode-urile, stocul și prețul de achiziție. O insignă „ales acum" marchează produsul la care aplicația trimite/importă acum prețuri pentru acel barcode (cel din moyskladByBarcode). Toast-ul de succes al sincronizării catalogului avertizează și el când există grupuri duplicate.</w:t>
+      </w:r>
+    </w:p>
+    <w:p>
+      <w:pPr>
+        <w:pStyle w:val="ListBullet"/>
+      </w:pPr>
+      <w:r>
+        <w:t>Remedierea se face în MoySklad (se șterge sau se arhivează duplicatul în plus), apoi se resincronizează catalogul. Doar produsele nearhivate ajung în catalog, deci un duplicat deja arhivat nu apare în raport. Nicio schimbare pe Worker: catalogul întorcea deja code și barcodes, deci nu e nevoie de redeploy — modificarea e numai în index.html.</w:t>
+      </w:r>
+    </w:p>
+    <w:p>
+      <w:pPr>
+        <w:pStyle w:val="Heading3"/>
+      </w:pPr>
+      <w:r>
+        <w:t>Sincronizare automată a catalogului înainte de import/trimitere de prețuri</w:t>
+      </w:r>
+    </w:p>
+    <w:p>
+      <w:pPr/>
+      <w:r>
+        <w:t>Înainte, importul și trimiterea de prețuri dintr-o comandă lăsau utilizatorul să sincronizeze manual catalogul (mesajul era „sincronizează catalogul și încearcă din nou"), iar un catalog vechi făcea ca produsele create recent în MoySklad să apară drept „nelegate". Acum prepareOrderForMoySklad(o) rulează PRIMUL, atât în ptImportPricesFromMoySklad, cât și în ptPushPricesToMoySklad:</w:t>
+      </w:r>
+    </w:p>
+    <w:p>
+      <w:pPr>
+        <w:pStyle w:val="ListBullet"/>
+      </w:pPr>
+      <w:r>
+        <w:t>Sincronizează automat catalogul (ptSyncCatalog) dacă: (1) catalogul local lipsește sau nu a fost niciodată sincronizat; sau (2) e mai vechi de 1 oră (MS_PREP_MAX_CATALOG_AGE_MS); sau (3) comanda conține produse nelegate de MoySklad ȘI ultima sincronizare e mai veche de 2 minute (MS_PREP_RECHECK_UNLINKED_MS).</w:t>
+      </w:r>
+    </w:p>
+    <w:p>
+      <w:pPr>
+        <w:pStyle w:val="ListBullet"/>
+      </w:pPr>
+      <w:r>
+        <w:t>Pauza de 2 minute din cazul (3) e deliberată: fără ea, o comandă cu produse care chiar nu există în MoySklad ar declanșa o sincronizare completă la fiecare apăsare de buton, iar MoySklad și-a dezactivat deja o dată accesul API pentru tot contul după o avalanșă de cereri (vezi secțiunea 10, incidentul cu backoff-ul).</w:t>
+      </w:r>
+    </w:p>
+    <w:p>
+      <w:pPr>
+        <w:pStyle w:val="ListBullet"/>
+      </w:pPr>
+      <w:r>
+        <w:t>Dacă sincronizarea automată eșuează: fără niciun catalog local, operația se oprește (eroarea e deja afișată de ptSyncCatalog); cu un catalog local mai vechi, un confirm() întreabă dacă se continuă cu el, arătând data lui.</w:t>
+      </w:r>
+    </w:p>
+    <w:p>
+      <w:pPr>
+        <w:pStyle w:val="ListBullet"/>
+      </w:pPr>
+      <w:r>
+        <w:t>După sincronizare, produsele comenzii sunt împărțite în trei: legate clar (se importă/trimit), nelegate (niciun produs MoySklad cu barcode-ul lor) și ambigue (2+ potriviri, vezi mai sus — se sar, iar mesajul arată codurile MoySklad ale candidaților). Funcția întoarce { keys, skippedNames, ambiguousNames }, sau null dacă operația trebuie oprită.</w:t>
+      </w:r>
+    </w:p>
+    <w:p>
+      <w:pPr>
+        <w:pStyle w:val="ListBullet"/>
+      </w:pPr>
+      <w:r>
+        <w:t>Un flag separat, msPrepareBusy, acoperă faza de pregătire (care poate dura câteva secunde): o a doua apăsare în acest interval nu face nimic — nici a doua sincronizare, nici a doua confirmare. Flagul existent msPriceSyncBusy se setează abia când începe efectiv scrierea/citirea.</w:t>
+      </w:r>
+    </w:p>
+    <w:p>
+      <w:pPr>
+        <w:pStyle w:val="ListBullet"/>
+      </w:pPr>
+      <w:r>
+        <w:t>window.ptSyncCatalog() întoarce acum o promisiune cu true/false (reușit sau nu) și, dacă o sincronizare e deja în curs (de exemplu cea automată de la pornire, secțiunea 8), întoarce ACEEAȘI promisiune (catalogSyncPromise) în loc să iasă tăcut — așa import/trimitere o pot aștepta, fără să lanseze o a doua sincronizare. Dacă URL-ul MoySklad nu e configurat în Setări, întoarce false.</w:t>
+      </w:r>
+    </w:p>
+    <w:p>
+      <w:pPr>
+        <w:pStyle w:val="Heading3"/>
+      </w:pPr>
+      <w:r>
         <w:t>Variabile configurate pe Worker (Cloudflare → Settings → Variables and secrets)</w:t>
       </w:r>
     </w:p>
@@ -1490,6 +1606,38 @@
     </w:p>
     <w:p>
       <w:pPr>
+        <w:pStyle w:val="ListBullet"/>
+      </w:pPr>
+      <w:r>
+        <w:t>Un produs al cărui barcode există la 2+ produse MoySklad (duplicat) arată, sub linia de stoc, un avertisment roșu „⚠ barcode duplicat în MoySklad (N produse) — nu se importă/trimite" (condiția: moyskladMatches(p).length &gt; 1). Hover-ul explică și că stocul afișat poate fi al produsului greșit.</w:t>
+      </w:r>
+    </w:p>
+    <w:p>
+      <w:pPr>
+        <w:pStyle w:val="ListBullet"/>
+      </w:pPr>
+      <w:r>
+        <w:t>Importul și trimiterea de prețuri SAR peste aceste produse, în loc să scrie pe ghicite pe unul dintre duplicate. Sunt anunțate în mai multe locuri: în dialogul de confirmare dinainte de trimitere (numărul și primele 5 nume, cu trimitere la „Verifică duplicate"; importul nu are dialog de confirmare), în toast-ul de rezultat („N sărite — barcode duplicat în MoySklad"), în lista roșie persistentă de sub tabel (cu codurile produselor MoySklad din fiecare grup, ex. „cod: 8 / 9") și pe rândul produsului. Dacă nu rămâne niciun produs de importat/trimis (toate sunt nelegate sau ambigue), toast-ul de eroare spune de ce.</w:t>
+      </w:r>
+    </w:p>
+    <w:p>
+      <w:pPr>
+        <w:pStyle w:val="ListBullet"/>
+      </w:pPr>
+      <w:r>
+        <w:t>Tehnic: starea lastMsSyncFailed are acum și un tablou ambiguousNames, randat de orderPricingFooterHtml ca al treilea paragraf al casetei roșii de sub tabel (după „Eroare" și „Nelegate"). O stare de formă veche, fără ambiguousNames, se randează în continuare fără erori — codul verifică întâi că tabloul există.</w:t>
+      </w:r>
+    </w:p>
+    <w:p>
+      <w:pPr>
+        <w:pStyle w:val="ListBullet"/>
+      </w:pPr>
+      <w:r>
+        <w:t>Textul casetei pentru produsele nelegate s-a schimbat: nu mai sugerează un catalog vechi, ci spune că în MoySklad nu există un produs cu barcode-ul lor („catalogul a fost sincronizat automat chiar înainte"), fiindcă sincronizarea automată (secțiunea 6) rulează înaintea fiecărui import/trimitere. Avertismentul de catalog învechit (peste 24h) din capul tabelului (orderCatalogStaleWarningHtml) a rămas, dar sincronizarea manuală sugerată acolo nu mai e necesară înainte de import/trimitere.</w:t>
+      </w:r>
+    </w:p>
+    <w:p>
+      <w:pPr>
         <w:pStyle w:val="Heading3"/>
       </w:pPr>
       <w:r>
@@ -1501,7 +1649,7 @@
         <w:pStyle w:val="ListBullet"/>
       </w:pPr>
       <w:r>
-        <w:t>„📥 Importă prețuri din MoySklad" — aduce valorile curente (dacă există) ca punct de plecare. Dacă un produs nu e legat de MoySklad sau importul unui câmp eșuează, numele produsului apare listat explicit sub tabel (nu doar un număr de eșecuri) — separat pe „nelegate de MoySklad" (trebuie sincronizat catalogul) și „eșuate" (o eroare reală la acel produs).</w:t>
+        <w:t>„📥 Importă prețuri din MoySklad" — aduce valorile curente (dacă există) ca punct de plecare. Dacă un produs nu e legat de MoySklad sau importul unui câmp eșuează, numele produsului apare listat explicit sub tabel (nu doar un număr de eșecuri) — separat pe „nelegate de MoySklad" (nu există în MoySklad un produs cu acel barcode — catalogul e sincronizat automat chiar înainte, secțiunea 6), „sărite — barcode duplicat în MoySklad" (vezi secțiunea 6) și „eșuate" (o eroare reală la acel produs).</w:t>
       </w:r>
     </w:p>
     <w:p>
@@ -1509,7 +1657,7 @@
         <w:pStyle w:val="ListBullet"/>
       </w:pPr>
       <w:r>
-        <w:t>„📤 Trimite prețurile în MoySklad" — scrie înapoi toate cele 7 câmpuri, cu o reîncercare automată pe fiecare eșec trecător (vezi secțiunea 6).</w:t>
+        <w:t>„📤 Trimite prețurile în MoySklad" — scrie înapoi toate cele 7 câmpuri, cu o reîncercare automată pe fiecare eșec trecător (vezi secțiunea 6). Înainte de trimitere catalogul se sincronizează automat, iar dialogul de confirmare listează produsele sărite din cauza barcode-ului duplicat.</w:t>
       </w:r>
     </w:p>
     <w:p>
@@ -1517,7 +1665,7 @@
         <w:pStyle w:val="ListBullet"/>
       </w:pPr>
       <w:r>
-        <w:t>Un produs care apare ca „eșuat" (nu „nelegat") de obicei înseamnă că ID-ul MoySklad ținut minte local pentru el nu mai e valid (ex. un duplicat șters manual în MoySklad) — soluția e resincronizarea catalogului din Comparație produse, apoi reîncercarea sincronizării comenzii.</w:t>
+        <w:t>Un produs care apare ca „eșuat" (nu „nelegat") de obicei înseamnă că ID-ul MoySklad ținut minte local pentru el nu mai e valid (ex. un duplicat șters manual în MoySklad) — soluția e resincronizarea manuală a catalogului (Produse MoySklad → „Sincronizează catalogul MoySklad", sau „Actualizează MoySklad" din Comparație produse), apoi reîncercarea sincronizării comenzii — sincronizarea automată de dinaintea importului/trimiterii nu o declanșează dacă catalogul local are sub o oră, iar produsul încă pare legat.</w:t>
       </w:r>
     </w:p>
     <w:p>
@@ -1570,7 +1718,15 @@
         <w:pStyle w:val="ListBullet"/>
       </w:pPr>
       <w:r>
-        <w:t>Sincronizarea catalogului (ptSyncCatalog) pornește acum automat, în fundal, la deschiderea aplicației, dacă nu există încă un cache local sau acesta are peste 24 de ore vechime — același prag de 24h folosit deja la avertismentul de catalog învechit din Comenzi (orderCatalogStaleWarningHtml). Nu blochează afișarea; înainte sincronizarea catalogului era 100% manuală.</w:t>
+        <w:t>Sincronizarea catalogului (ptSyncCatalog) pornește acum automat, în fundal, la deschiderea aplicației, dacă nu există încă un cache local sau acesta are peste 24 de ore vechime — același prag de 24h folosit deja la avertismentul de catalog învechit din Comenzi (orderCatalogStaleWarningHtml). Nu blochează afișarea; înainte sincronizarea catalogului era 100% manuală. Aceeași funcție e apelată automat și înainte de fiecare import/trimitere de prețuri din Comenzi (regulile în secțiunea 6).</w:t>
+      </w:r>
+    </w:p>
+    <w:p>
+      <w:pPr>
+        <w:pStyle w:val="ListBullet"/>
+      </w:pPr>
+      <w:r>
+        <w:t>Butonul „Verifică duplicate" (bara de sus, vizibil doar după ce există un catalog sincronizat) deschide raportul produselor MoySklad cu același barcode sau același cod — detaliile în secțiunea 6. Comutarea între vederile tab-ului (branduri / arhivate / duplicate) se face prin window.ptSetCatalogView(view) și window.ptBackToBrands(), starea fiind ținută în catalogShowHiddenBrands și catalogShowDuplicates.</w:t>
       </w:r>
     </w:p>
     <w:p>
@@ -2072,6 +2228,22 @@
     </w:p>
     <w:p>
       <w:pPr>
+        <w:pStyle w:val="ListBullet"/>
+      </w:pPr>
+      <w:r>
+        <w:t>Prețurile ajungeau (sau erau aduse) de la produsul MoySklad greșit când același produs exista de două ori în MoySklad (același barcode/cod). Simptom: după „Trimite prețurile în MoySklad" sau „Importă prețuri din MoySklad", valorile apăreau pe un alt produs decât cel din comandă — fără nicio eroare. Cauza: indexul moyskladByBarcode reținea UN singur produs per barcode, ultimul întâlnit în catalog, deci aplicația alegea tăcut unul din cele două duplicate, iar ordinea din catalog hotăra unde ajungeau prețurile. Reparat prin indexul complet moyskladAllByBarcode + findCatalogDuplicates (raportul „Verifică duplicate" din Produse MoySklad) + sărirea la import/trimitere a produselor cu potrivire ambiguă, anunțate în dialog, în toast, în lista de sub tabel și pe rândul produsului (secțiunile 6 și 7.4). Remedierea reală rămâne în MoySklad: duplicatul în plus se șterge sau se arhivează, apoi se resincronizează catalogul. În aceeași zonă: import/trimitere sincronizează acum singure catalogul înainte (secțiunea 6), iar mesajul pentru produsele „nelegate" nu mai trimite utilizatorul la o sincronizare manuală.</w:t>
+      </w:r>
+    </w:p>
+    <w:p>
+      <w:pPr>
+        <w:pStyle w:val="ListBullet"/>
+      </w:pPr>
+      <w:r>
+        <w:t>Butoanele „🗄 Arhivate" și „◀ Înapoi la branduri" din Produse MoySklad nu făceau nimic la apăsare. Cauza: erau scrise ca onclick inline (onclick="catalogShowHiddenBrands=true;renderCatalog()"), dar acele variabile și funcții trăiesc în interiorul închiderii aplicației (un IIFE), nu pe window — deci fiecare clic arunca un ReferenceError tăcut, vizibil doar în consola browserului. Reparat prin funcții expuse explicit pe window: ptSetCatalogView(view) și ptBackToBrands(). Același defect avea și butonul „🗄 Arhivate în acest brand" / „◀ Înapoi la produsele active" din lista de produse a unui brand — reparat prin ptToggleHiddenProductsView(); o căutare în tot index.html după onclick-uri inline care fac atribuiri sau apelează funcții de randare nu a mai găsit alte cazuri. De reținut: un onclick inline poate apela DOAR ce e pus explicit pe window (tiparul window.ptXxx = function), niciodată o variabilă sau o funcție locală a închiderii.</w:t>
+      </w:r>
+    </w:p>
+    <w:p>
+      <w:pPr>
         <w:pStyle w:val="Heading1"/>
       </w:pPr>
       <w:r>
@@ -2107,7 +2279,7 @@
         <w:pStyle w:val="ListBullet"/>
       </w:pPr>
       <w:r>
-        <w:t>Datele MoySklad (stoc, catalog, istoric, prețuri) nu se actualizează singure — necesită apăsarea manuală a butoanelor de sincronizare.</w:t>
+        <w:t>Datele MoySklad (stoc, catalog, istoric, prețuri) nu se actualizează în timp real: catalogul se resincronizează automat doar la pornirea aplicației (dacă are peste 24 de ore) și înainte de un import/trimitere de prețuri din Comenzi (regulile din secțiunea 6); în rest, necesită apăsarea manuală a butoanelor de sincronizare.</w:t>
       </w:r>
     </w:p>
     <w:p>
@@ -2131,6 +2303,14 @@
         <w:pStyle w:val="ListBullet"/>
       </w:pPr>
       <w:r>
+        <w:t>Detectarea duplicatelor MoySklad se bazează doar pe barcode sau cod identic, între produsele nearhivate din catalogul sincronizat: același produs introdus de două ori cu barcode ȘI cod diferite nu e prins, iar un duplicat arhivat nu apare. Raportul „Verifică duplicate" e la fel de proaspăt ca ultima sincronizare a catalogului.</w:t>
+      </w:r>
+    </w:p>
+    <w:p>
+      <w:pPr>
+        <w:pStyle w:val="ListBullet"/>
+      </w:pPr>
+      <w:r>
         <w:t>Barcode-urile lipsă sau greșite la import NU se corectează niciodată automat, din principiu.</w:t>
       </w:r>
     </w:p>
@@ -2195,7 +2375,7 @@
         <w:pStyle w:val="ListBullet"/>
       </w:pPr>
       <w:r>
-        <w:t>Importul/trimiterea de prețuri cu MoySklad eșuează pentru anumite produse → citește lista de nume afișată sub tabelul comenzii (secțiunea 7.5); dacă apar ca „nelegate", resincronizează catalogul din Comparație produse; dacă apar ca „eșuate", verifică prin ?rawproduct=&lt;id&gt; pe Worker.</w:t>
+        <w:t>Importul/trimiterea de prețuri cu MoySklad eșuează sau sare peste anumite produse → citește lista de nume afișată sub tabelul comenzii (secțiunea 7.5). „Nelegate" = în MoySklad nu există un produs cu barcode-ul lor (catalogul a fost sincronizat automat chiar înainte) — corectează barcode-ul sau adaugă produsul în MoySklad. „Sărite — barcode duplicat" → tab Produse MoySklad → „Verifică duplicate", șterge sau arhivează duplicatul în plus în MoySklad, resincronizează catalogul și reîncearcă. „Eșuate" → verifică prin ?rawproduct=&lt;id&gt; pe Worker; dacă pare un ID MoySklad învechit, resincronizează manual catalogul.</w:t>
       </w:r>
     </w:p>
     <w:p>

</xml_diff>

<commit_message>
Documentație: fix «Deblochează câmpurile» (prețuri de vînzare readuse la valori vechi)
Documentația tehnică: cauza (instantaneu msAttrsCache suprascria Prețul de vînzare la randare),
soluția (MoySklad doar completează un preț lipsă), clarificarea că marcajele nu protejează de
«Importă prețuri din MoySklad» și neconcordanța cunoscută rămasă.
Manualul: ce face deblocarea (doar scoate marcajele, nu schimbă prețuri, nu e necesară la
trimitere) + o întrebare nouă în secțiunea de întrebări frecvente.

Co-Authored-By: Claude Sonnet 5.5 <noreply@anthropic.com>
</commit_message>
<xml_diff>
--- a/Panou achizitii - documentatie tehnica.docx
+++ b/Panou achizitii - documentatie tehnica.docx
@@ -17,7 +17,7 @@
     </w:p>
     <w:p>
       <w:r>
-        <w:t>Actualizat: 2026-10-06, cu detectarea produselor MoySklad duplicate și protecția împotriva scrierii prețurilor pe produsul greșit (importul/trimiterea de prețuri sar peste barcode-urile duplicate, iar tab-ul Produse MoySklad are un raport „Verifică duplicate"), sincronizarea automată a catalogului MoySklad înainte de fiecare import/trimitere de prețuri, și repararea butoanelor „Arhivate" / „Înapoi la branduri" / „Arhivate în acest brand" din Produse MoySklad, care nu făceau nimic. Actualizarea anterioară (2026-10-02) adusese: persistența redesenată complet (produsele, comenzile și listele de preț au acum propriile tabele în Supabase, cu salvare pe bucăți — vezi secțiunea 5), o reparație critică la limitarea de rată MoySklad (care dezactivase temporar accesul API pentru tot contul), corectarea a două bug-uri grave la prețurile Secundar/Pachet 1-3 din Comenzi (reveneau silențios la valori vechi), protecție la pierderea modificărilor dintr-un refresh rapid (Ctrl+F5), sincronizare automată a catalogului MoySklad la pornire, afișarea stocului MoySklad direct în Comenzi, și corectări de căutare/redimensionare în Comparație produse. De asemenea: eticheta de rutină „sinecost: ..." eliminată din Comenzi, tabelele cu scroll (inclusiv tabelul de prețuri din Comenzi) care se extind acum dinamic pe măsură ce derulezi pagina, și lățimea maximă a aplicației mărită la 2000px.</w:t>
+        <w:t>Actualizat: 2026-10-06, cu detectarea produselor MoySklad duplicate și protecția împotriva scrierii prețurilor pe produsul greșit (importul/trimiterea de prețuri sar peste barcode-urile duplicate, iar tab-ul Produse MoySklad are un raport „Verifică duplicate"), sincronizarea automată a catalogului MoySklad înainte de fiecare import/trimitere de prețuri, și repararea butoanelor „Arhivate" / „Înapoi la branduri" / „Arhivate în acest brand" din Produse MoySklad, care nu făceau nimic, și repararea butonului „Deblochează câmpurile" din Comenzi, care readucea prețurile de vânzare vechi. Actualizarea anterioară (2026-10-02) adusese: persistența redesenată complet (produsele, comenzile și listele de preț au acum propriile tabele în Supabase, cu salvare pe bucăți — vezi secțiunea 5), o reparație critică la limitarea de rată MoySklad (care dezactivase temporar accesul API pentru tot contul), corectarea a două bug-uri grave la prețurile Secundar/Pachet 1-3 din Comenzi (reveneau silențios la valori vechi), protecție la pierderea modificărilor dintr-un refresh rapid (Ctrl+F5), sincronizare automată a catalogului MoySklad la pornire, afișarea stocului MoySklad direct în Comenzi, și corectări de căutare/redimensionare în Comparație produse. De asemenea: eticheta de rutină „sinecost: ..." eliminată din Comenzi, tabelele cu scroll (inclusiv tabelul de prețuri din Comenzi) care se extind acum dinamic pe măsură ce derulezi pagina, și lățimea maximă a aplicației mărită la 2000px.</w:t>
       </w:r>
     </w:p>
     <w:p>
@@ -1553,7 +1553,7 @@
         <w:pStyle w:val="ListBullet"/>
       </w:pPr>
       <w:r>
-        <w:t>Fiecare câmp de preț capătă o margine verde imediat ce a fost editat manual (per câmp, nu doar per produs) — câmpul respectiv nu mai e suprascris automat de o sincronizare ulterioară din MoySklad.</w:t>
+        <w:t>Fiecare câmp de preț capătă o margine verde imediat ce a fost editat manual (per câmp, nu doar per produs) — câmpul respectiv nu mai e recalculat automat (Secundar și Pachet 1/2/3 urmăresc Prețul de vânzare curent doar cât sunt nemarcate). Marcajul nu protejează însă de butonul explicit „Importă prețuri din MoySklad": acela suprascrie prețurile locale cu cele din MoySklad, indiferent de marcaje. „Deblochează câmpurile" (ptResetReviewedFields) șterge doar marcajele (o.reviewedFields) — nu schimbă niciun preț, și nu e necesar pentru trimiterea în MoySklad.</w:t>
       </w:r>
     </w:p>
     <w:p>
@@ -2200,6 +2200,14 @@
       </w:pPr>
       <w:r>
         <w:t>Un preț corectat manual (Secundar, Pachet 2, Pachet 3) putea reveni singur la o valoare veche imediat după „deblocare" sau după un reimport din MoySklad. Cauza: msAttrsCache ține un instantaneu al atributelor MoySklad, luat o singură dată per produs per sesiune de browser, niciodată reîmprospătat — dar un bloc de cod separat îl folosea ca să suprascrie necondiționat Secundar/Pachet 2/Pachet 3 la fiecare randare a câmpurilor „neverificate", chiar și peste o valoare tocmai recalculată corect cu o clipă înainte, în aceeași randare. Rezultatul: editezi un preț, pare corect o clipă, apoi e înlocuit instant cu valoarea veche — iar aceea ajungea să fie exact ce se trimitea mai departe în MoySklad la „Trimite prețurile". Reparat eliminând suprascrierea pentru Secundar/Pachet 2/Pachet 3, aliniindu-le la Pachet 1 (care avea deja acest comportament corect, cu explicația deja scrisă în cod — pur și simplu nu fusese aplicată și la celelalte).</w:t>
+      </w:r>
+    </w:p>
+    <w:p>
+      <w:pPr>
+        <w:pStyle w:val="ListBullet"/>
+      </w:pPr>
+      <w:r>
+        <w:t>Butonul „🔓 Deblochează câmpurile verificate manual" readucea prețurile de vânzare la valori vechi (raportat: tastezi un preț nou, apeși Deblochează, prețul revine la cel anterior). Cauza: în buildOrderPricingTableInnerHtml, Prețul de vânzare al fiecărui câmp NEmarcat „verificat" era suprascris la fiecare randare cu valoarea din msAttrsCache — instantaneul luat o singură dată per produs per sesiune, nu o valoare live. Cât timp câmpul rămânea marcat nu se vedea nimic; dar ptResetReviewedFields golește o.reviewedFields, deci la randarea următoare TOATE prețurile de vânzare reveneau la instantaneul vechi — iar o trimitere ulterioară în MoySklad ar fi scris prețul vechi peste cel corect. Probabil aceeași cauză a raportării anterioare „285 revine la 345". Același defect fusese deja reparat la Secundar/Pachet 1/2/3 (vezi bullet-ul anterior), dar rămăsese neatins la Prețul de vânzare. Reparat: msLive (care citește msAttrsCache) poate acum doar COMPLETA un Preț de vânzare lipsă (null, nemarcat; un 0 din MoySklad e tratat ca „necompletat"), niciodată suprascrie unul existent; valorile curente din MoySklad se aduc doar prin butonul explicit „Importă prețuri din MoySklad". Textul dialogului de confirmare, titlul butonului, toast-ul și legenda din subsolul tabelului au fost rescrise, ca să spună clar că deblocarea scoate doar marcajele verzi. Rămâne o neconcordanță cunoscută, deliberat necorectată fără decizia utilizatorului: ptImportPricesFromMoySklad nu ține cont de marcaje (suprascrie și câmpurile marcate) — vechea legendă sugera contrariul.</w:t>
       </w:r>
     </w:p>
     <w:p>

</xml_diff>

<commit_message>
Documentație: Secundar în roșu cînd diferă de Prețul de vînzare
Co-Authored-By: Claude Sonnet 5.5 <noreply@anthropic.com>
</commit_message>
<xml_diff>
--- a/Panou achizitii - documentatie tehnica.docx
+++ b/Panou achizitii - documentatie tehnica.docx
@@ -17,7 +17,7 @@
     </w:p>
     <w:p>
       <w:r>
-        <w:t>Actualizat: 2026-10-06, cu detectarea produselor MoySklad duplicate și protecția împotriva scrierii prețurilor pe produsul greșit (importul/trimiterea de prețuri sar peste barcode-urile duplicate, iar tab-ul Produse MoySklad are un raport „Verifică duplicate"), sincronizarea automată a catalogului MoySklad înainte de fiecare import/trimitere de prețuri, și repararea butoanelor „Arhivate" / „Înapoi la branduri" / „Arhivate în acest brand" din Produse MoySklad, care nu făceau nimic, și repararea butonului „Deblochează câmpurile" din Comenzi, care readucea prețurile de vânzare vechi. Actualizarea anterioară (2026-10-02) adusese: persistența redesenată complet (produsele, comenzile și listele de preț au acum propriile tabele în Supabase, cu salvare pe bucăți — vezi secțiunea 5), o reparație critică la limitarea de rată MoySklad (care dezactivase temporar accesul API pentru tot contul), corectarea a două bug-uri grave la prețurile Secundar/Pachet 1-3 din Comenzi (reveneau silențios la valori vechi), protecție la pierderea modificărilor dintr-un refresh rapid (Ctrl+F5), sincronizare automată a catalogului MoySklad la pornire, afișarea stocului MoySklad direct în Comenzi, și corectări de căutare/redimensionare în Comparație produse. De asemenea: eticheta de rutină „sinecost: ..." eliminată din Comenzi, tabelele cu scroll (inclusiv tabelul de prețuri din Comenzi) care se extind acum dinamic pe măsură ce derulezi pagina, și lățimea maximă a aplicației mărită la 2000px.</w:t>
+        <w:t>Actualizat: 2026-10-06, cu detectarea produselor MoySklad duplicate și protecția împotriva scrierii prețurilor pe produsul greșit (importul/trimiterea de prețuri sar peste barcode-urile duplicate, iar tab-ul Produse MoySklad are un raport „Verifică duplicate"), sincronizarea automată a catalogului MoySklad înainte de fiecare import/trimitere de prețuri, și repararea butoanelor „Arhivate" / „Înapoi la branduri" / „Arhivate în acest brand" din Produse MoySklad, care nu făceau nimic, și repararea butonului „Deblochează câmpurile" din Comenzi, care readucea prețurile de vânzare vechi, plus afișarea în roșu a Secundarului când diferă de Prețul de vânzare. Actualizarea anterioară (2026-10-02) adusese: persistența redesenată complet (produsele, comenzile și listele de preț au acum propriile tabele în Supabase, cu salvare pe bucăți — vezi secțiunea 5), o reparație critică la limitarea de rată MoySklad (care dezactivase temporar accesul API pentru tot contul), corectarea a două bug-uri grave la prețurile Secundar/Pachet 1-3 din Comenzi (reveneau silențios la valori vechi), protecție la pierderea modificărilor dintr-un refresh rapid (Ctrl+F5), sincronizare automată a catalogului MoySklad la pornire, afișarea stocului MoySklad direct în Comenzi, și corectări de căutare/redimensionare în Comparație produse. De asemenea: eticheta de rutină „sinecost: ..." eliminată din Comenzi, tabelele cu scroll (inclusiv tabelul de prețuri din Comenzi) care se extind acum dinamic pe măsură ce derulezi pagina, și lățimea maximă a aplicației mărită la 2000px.</w:t>
       </w:r>
     </w:p>
     <w:p>
@@ -1554,6 +1554,14 @@
       </w:pPr>
       <w:r>
         <w:t>Fiecare câmp de preț capătă o margine verde imediat ce a fost editat manual (per câmp, nu doar per produs) — câmpul respectiv nu mai e recalculat automat (Secundar și Pachet 1/2/3 urmăresc Prețul de vânzare curent doar cât sunt nemarcate). Marcajul nu protejează însă de butonul explicit „Importă prețuri din MoySklad": acela suprascrie prețurile locale cu cele din MoySklad, indiferent de marcaje. „Deblochează câmpurile" (ptResetReviewedFields) șterge doar marcajele (o.reviewedFields) — nu schimbă niciun preț, și nu e necesar pentru trimiterea în MoySklad.</w:t>
+      </w:r>
+    </w:p>
+    <w:p>
+      <w:pPr>
+        <w:pStyle w:val="ListBullet"/>
+      </w:pPr>
+      <w:r>
+        <w:t>Coloana „Secundar · pachete": prețul Secundar (și procentul lui) se afișează în roșu (var(--bad)) când, rotunjit la leu, diferă de Prețul de vânzare — adică există o reducere activă (implicit 15%), ușor de uitat. Calculul e secDiffers în packagesGroupCellHtml; în rezumatul colapsat colorează valoarea și procentul (cu title explicativ), în vederea extinsă colorează câmpurile Secundar. Fără Preț de vânzare sau fără secundar, nu se colorează nimic.</w:t>
       </w:r>
     </w:p>
     <w:p>

</xml_diff>

<commit_message>
Documentație: reîmprospătarea istoricului de achiziții (cache cu fetchedAt, 30 min)
Co-Authored-By: Claude Sonnet 5.5 <noreply@anthropic.com>
</commit_message>
<xml_diff>
--- a/Panou achizitii - documentatie tehnica.docx
+++ b/Panou achizitii - documentatie tehnica.docx
@@ -17,7 +17,7 @@
     </w:p>
     <w:p>
       <w:r>
-        <w:t>Actualizat: 2026-10-06, cu detectarea produselor MoySklad duplicate și protecția împotriva scrierii prețurilor pe produsul greșit (importul/trimiterea de prețuri sar peste barcode-urile duplicate, iar tab-ul Produse MoySklad are un raport „Verifică duplicate"), sincronizarea automată a catalogului MoySklad înainte de fiecare import/trimitere de prețuri, și repararea butoanelor „Arhivate" / „Înapoi la branduri" / „Arhivate în acest brand" din Produse MoySklad, care nu făceau nimic, și repararea butonului „Deblochează câmpurile" din Comenzi, care readucea prețurile de vânzare vechi, plus afișarea în roșu a Secundarului când diferă de Prețul de vânzare. Actualizarea anterioară (2026-10-02) adusese: persistența redesenată complet (produsele, comenzile și listele de preț au acum propriile tabele în Supabase, cu salvare pe bucăți — vezi secțiunea 5), o reparație critică la limitarea de rată MoySklad (care dezactivase temporar accesul API pentru tot contul), corectarea a două bug-uri grave la prețurile Secundar/Pachet 1-3 din Comenzi (reveneau silențios la valori vechi), protecție la pierderea modificărilor dintr-un refresh rapid (Ctrl+F5), sincronizare automată a catalogului MoySklad la pornire, afișarea stocului MoySklad direct în Comenzi, și corectări de căutare/redimensionare în Comparație produse. De asemenea: eticheta de rutină „sinecost: ..." eliminată din Comenzi, tabelele cu scroll (inclusiv tabelul de prețuri din Comenzi) care se extind acum dinamic pe măsură ce derulezi pagina, și lățimea maximă a aplicației mărită la 2000px.</w:t>
+        <w:t>Actualizat: 2026-10-06, cu detectarea produselor MoySklad duplicate și protecția împotriva scrierii prețurilor pe produsul greșit (importul/trimiterea de prețuri sar peste barcode-urile duplicate, iar tab-ul Produse MoySklad are un raport „Verifică duplicate"), sincronizarea automată a catalogului MoySklad înainte de fiecare import/trimitere de prețuri, și repararea butoanelor „Arhivate" / „Înapoi la branduri" / „Arhivate în acest brand" din Produse MoySklad, care nu făceau nimic, și repararea butonului „Deblochează câmpurile" din Comenzi, care readucea prețurile de vânzare vechi, plus afișarea în roșu a Secundarului când diferă de Prețul de vânzare și repararea istoricului de achiziții, care nu-și mai reîmprospăta niciodată cache-ul (ultima recepție lipsea). Actualizarea anterioară (2026-10-02) adusese: persistența redesenată complet (produsele, comenzile și listele de preț au acum propriile tabele în Supabase, cu salvare pe bucăți — vezi secțiunea 5), o reparație critică la limitarea de rată MoySklad (care dezactivase temporar accesul API pentru tot contul), corectarea a două bug-uri grave la prețurile Secundar/Pachet 1-3 din Comenzi (reveneau silențios la valori vechi), protecție la pierderea modificărilor dintr-un refresh rapid (Ctrl+F5), sincronizare automată a catalogului MoySklad la pornire, afișarea stocului MoySklad direct în Comenzi, și corectări de căutare/redimensionare în Comparație produse. De asemenea: eticheta de rutină „sinecost: ..." eliminată din Comenzi, tabelele cu scroll (inclusiv tabelul de prețuri din Comenzi) care se extind acum dinamic pe măsură ce derulezi pagina, și lățimea maximă a aplicației mărită la 2000px.</w:t>
       </w:r>
     </w:p>
     <w:p>
@@ -1718,7 +1718,7 @@
         <w:pStyle w:val="ListBullet"/>
       </w:pPr>
       <w:r>
-        <w:t>Săgeata de lângă fiecare produs expandează istoricul de achiziții, încărcat la cerere.</w:t>
+        <w:t>Săgeata de lângă fiecare produs expandează istoricul de achiziții, încărcat la cerere. Istoricul se ține în cache local (localStorage) și se reîmprospătează automat în fundal după 30 de minute.</w:t>
       </w:r>
     </w:p>
     <w:p>
@@ -2216,6 +2216,14 @@
       </w:pPr>
       <w:r>
         <w:t>Butonul „🔓 Deblochează câmpurile verificate manual" readucea prețurile de vânzare la valori vechi (raportat: tastezi un preț nou, apeși Deblochează, prețul revine la cel anterior). Cauza: în buildOrderPricingTableInnerHtml, Prețul de vânzare al fiecărui câmp NEmarcat „verificat" era suprascris la fiecare randare cu valoarea din msAttrsCache — instantaneul luat o singură dată per produs per sesiune, nu o valoare live. Cât timp câmpul rămânea marcat nu se vedea nimic; dar ptResetReviewedFields golește o.reviewedFields, deci la randarea următoare TOATE prețurile de vânzare reveneau la instantaneul vechi — iar o trimitere ulterioară în MoySklad ar fi scris prețul vechi peste cel corect. Probabil aceeași cauză a raportării anterioare „285 revine la 345". Același defect fusese deja reparat la Secundar/Pachet 1/2/3 (vezi bullet-ul anterior), dar rămăsese neatins la Prețul de vânzare. Reparat: msLive (care citește msAttrsCache) poate acum doar COMPLETA un Preț de vânzare lipsă (null, nemarcat; un 0 din MoySklad e tratat ca „necompletat"), niciodată suprascrie unul existent; valorile curente din MoySklad se aduc doar prin butonul explicit „Importă prețuri din MoySklad". Textul dialogului de confirmare, titlul butonului, toast-ul și legenda din subsolul tabelului au fost rescrise, ca să spună clar că deblocarea scoate doar marcajele verzi. Rămâne o neconcordanță cunoscută, deliberat necorectată fără decizia utilizatorului: ptImportPricesFromMoySklad nu ține cont de marcaje (suprascrie și câmpurile marcate) — vechea legendă sugera contrariul.</w:t>
+      </w:r>
+    </w:p>
+    <w:p>
+      <w:pPr>
+        <w:pStyle w:val="ListBullet"/>
+      </w:pPr>
+      <w:r>
+        <w:t>Ultima recepție (приемка) din MoySklad nu apărea niciodată în coloana „Istoric" / în istoricul de achiziții (raportat: recepția din 22.09.2026, 200 buc la 134,49, lipsea; se vedeau doar cele din aprilie și februarie). Worker-ul (ruta ?history=) returna corect recepția nouă — verificat direct pe URL-ul live. Cauza era în browser: catalogHistoryCache se salvează în localStorage (pt_history_cache_v1) și ensureHistoryLoaded ieșea imediat la ORICE intrare existentă, deci istoricul adus o singură dată nu se mai reîmprospăta niciodată. Reparat: fiecare intrare are fetchedAt și, după 30 de minute (HISTORY_MAX_AGE_MS), se reîmprospătează în fundal la următoarea afișare — istoricul vechi rămâne vizibil până sosește cel nou și rămâne și dacă reîmprospătarea eșuează (reîncercare după 10 minute, retryAt). Intrările vechi din localStorage, fără fetchedAt, se reîmprospătează o dată. Protecție la limita de rată: un răspuns 429 oprește 20 de secunde întreaga coadă de istoric (historyPausedUntil), cu maximum 3 reluări per produs (historyRetries); prima încărcare eșuată rămâne ca eroare în sesiune, ca înainte, ca să nu existe bucle de reîncercare la fiecare randare. Istoricul se aduce în continuare doar pentru produsele afișate într-o listă restrânsă (căutare sau brand ales), într-o comandă deschisă sau la expandarea unui produs.</w:t>
       </w:r>
     </w:p>
     <w:p>

</xml_diff>

<commit_message>
Documentație: mesaje de eroare umane pentru mentenanța MoySklad
Co-Authored-By: Claude Sonnet 5.5 <noreply@anthropic.com>
</commit_message>
<xml_diff>
--- a/Panou achizitii - documentatie tehnica.docx
+++ b/Panou achizitii - documentatie tehnica.docx
@@ -17,7 +17,7 @@
     </w:p>
     <w:p>
       <w:r>
-        <w:t>Actualizat: 2026-10-06, cu detectarea produselor MoySklad duplicate și protecția împotriva scrierii prețurilor pe produsul greșit (importul/trimiterea de prețuri sar peste barcode-urile duplicate, iar tab-ul Produse MoySklad are un raport „Verifică duplicate"), sincronizarea automată a catalogului MoySklad înainte de fiecare import/trimitere de prețuri, și repararea butoanelor „Arhivate" / „Înapoi la branduri" / „Arhivate în acest brand" din Produse MoySklad, care nu făceau nimic, și repararea butonului „Deblochează câmpurile" din Comenzi, care readucea prețurile de vânzare vechi, plus afișarea în roșu a Secundarului când diferă de Prețul de vânzare și repararea istoricului de achiziții, care nu-și mai reîmprospăta niciodată cache-ul (ultima recepție lipsea). Actualizarea anterioară (2026-10-02) adusese: persistența redesenată complet (produsele, comenzile și listele de preț au acum propriile tabele în Supabase, cu salvare pe bucăți — vezi secțiunea 5), o reparație critică la limitarea de rată MoySklad (care dezactivase temporar accesul API pentru tot contul), corectarea a două bug-uri grave la prețurile Secundar/Pachet 1-3 din Comenzi (reveneau silențios la valori vechi), protecție la pierderea modificărilor dintr-un refresh rapid (Ctrl+F5), sincronizare automată a catalogului MoySklad la pornire, afișarea stocului MoySklad direct în Comenzi, și corectări de căutare/redimensionare în Comparație produse. De asemenea: eticheta de rutină „sinecost: ..." eliminată din Comenzi, tabelele cu scroll (inclusiv tabelul de prețuri din Comenzi) care se extind acum dinamic pe măsură ce derulezi pagina, și lățimea maximă a aplicației mărită la 2000px.</w:t>
+        <w:t>Actualizat: 2026-10-06, cu detectarea produselor MoySklad duplicate și protecția împotriva scrierii prețurilor pe produsul greșit (importul/trimiterea de prețuri sar peste barcode-urile duplicate, iar tab-ul Produse MoySklad are un raport „Verifică duplicate"), sincronizarea automată a catalogului MoySklad înainte de fiecare import/trimitere de prețuri, și repararea butoanelor „Arhivate" / „Înapoi la branduri" / „Arhivate în acest brand" din Produse MoySklad, care nu făceau nimic, și repararea butonului „Deblochează câmpurile" din Comenzi, care readucea prețurile de vânzare vechi, plus afișarea în roșu a Secundarului când diferă de Prețul de vânzare repararea istoricului de achiziții, care nu-și mai reîmprospăta niciodată cache-ul (ultima recepție lipsea), și mesaje de eroare umane pentru mentenanța/limitarea MoySklad (în loc de pagina HTML brută). Actualizarea anterioară (2026-10-02) adusese: persistența redesenată complet (produsele, comenzile și listele de preț au acum propriile tabele în Supabase, cu salvare pe bucăți — vezi secțiunea 5), o reparație critică la limitarea de rată MoySklad (care dezactivase temporar accesul API pentru tot contul), corectarea a două bug-uri grave la prețurile Secundar/Pachet 1-3 din Comenzi (reveneau silențios la valori vechi), protecție la pierderea modificărilor dintr-un refresh rapid (Ctrl+F5), sincronizare automată a catalogului MoySklad la pornire, afișarea stocului MoySklad direct în Comenzi, și corectări de căutare/redimensionare în Comparație produse. De asemenea: eticheta de rutină „sinecost: ..." eliminată din Comenzi, tabelele cu scroll (inclusiv tabelul de prețuri din Comenzi) care se extind acum dinamic pe măsură ce derulezi pagina, și lățimea maximă a aplicației mărită la 2000px.</w:t>
       </w:r>
     </w:p>
     <w:p>
@@ -2224,6 +2224,14 @@
       </w:pPr>
       <w:r>
         <w:t>Ultima recepție (приемка) din MoySklad nu apărea niciodată în coloana „Istoric" / în istoricul de achiziții (raportat: recepția din 22.09.2026, 200 buc la 134,49, lipsea; se vedeau doar cele din aprilie și februarie). Worker-ul (ruta ?history=) returna corect recepția nouă — verificat direct pe URL-ul live. Cauza era în browser: catalogHistoryCache se salvează în localStorage (pt_history_cache_v1) și ensureHistoryLoaded ieșea imediat la ORICE intrare existentă, deci istoricul adus o singură dată nu se mai reîmprospăta niciodată. Reparat: fiecare intrare are fetchedAt și, după 30 de minute (HISTORY_MAX_AGE_MS), se reîmprospătează în fundal la următoarea afișare — istoricul vechi rămâne vizibil până sosește cel nou și rămâne și dacă reîmprospătarea eșuează (reîncercare după 10 minute, retryAt). Intrările vechi din localStorage, fără fetchedAt, se reîmprospătează o dată. Protecție la limita de rată: un răspuns 429 oprește 20 de secunde întreaga coadă de istoric (historyPausedUntil), cu maximum 3 reluări per produs (historyRetries); prima încărcare eșuată rămâne ca eroare în sesiune, ca înainte, ca să nu existe bucle de reîncercare la fiecare randare. Istoricul se aduce în continuare doar pentru produsele afișate într-o listă restrânsă (căutare sau brand ales), într-o comandă deschisă sau la expandarea unui produs.</w:t>
+      </w:r>
+    </w:p>
+    <w:p>
+      <w:pPr>
+        <w:pStyle w:val="ListBullet"/>
+      </w:pPr>
+      <w:r>
+        <w:t>În mentenanța MoySklad („Технические работы", HTTP 503) toast-ul „Nu am putut sincroniza catalogul MoySklad" afișa tot codul HTML al paginii de mentenanță (Worker-ul pune corpul brut al răspunsului MoySklad în câmpul detail, învelit într-un 502 propriu). Helper nou, humanMsErrorInfo(raw, status) → {text, transient}: preferă codul din textul brut (statusul real MoySklad) celui primit; recunoaște mentenanța (503 sau cuvintele-cheie din pagină), limita de rată (429 / cod 1061), conexiunea picată (Failed to fetch) și orice pagină HTML (mesaj generic cu codul); trunchiază textele peste 200 de caractere. Aplicat la: sincronizarea catalogului (cu mențiunea „Lucrezi în continuare cu ultimul catalog salvat"), testul conexiunii din Setări (sfatul „verifică URL-ul și secretele" apare doar pentru erori non-trecătoare), primul mesaj de eroare de la „Trimite prețurile" și erorile de istoric de achiziții. Erorile TRECĂTOARE de istoric au acum retryAt (reîncercare după 10 minute) — înainte rămâneau „Eroare" până la reîncărcarea paginii. Toast-urile de eroare stau pe ecran proporțional cu lungimea mesajului (60 ms/caracter, între 3,8 și 12 secunde) — mesajele noi sunt mai lungi (motiv + ce să faci).</w:t>
       </w:r>
     </w:p>
     <w:p>

</xml_diff>

<commit_message>
Documentație: trimiterea prețurilor în MoySklad doar pentru produsele modificate
Co-Authored-By: Claude Sonnet 5.5 <noreply@anthropic.com>
</commit_message>
<xml_diff>
--- a/Panou achizitii - documentatie tehnica.docx
+++ b/Panou achizitii - documentatie tehnica.docx
@@ -17,7 +17,7 @@
     </w:p>
     <w:p>
       <w:r>
-        <w:t>Actualizat: 2026-10-06, cu detectarea produselor MoySklad duplicate și protecția împotriva scrierii prețurilor pe produsul greșit (importul/trimiterea de prețuri sar peste barcode-urile duplicate, iar tab-ul Produse MoySklad are un raport „Verifică duplicate"), sincronizarea automată a catalogului MoySklad înainte de fiecare import/trimitere de prețuri, și repararea butoanelor „Arhivate" / „Înapoi la branduri" / „Arhivate în acest brand" din Produse MoySklad, care nu făceau nimic, și repararea butonului „Deblochează câmpurile" din Comenzi, care readucea prețurile de vânzare vechi, plus afișarea în roșu a Secundarului când diferă de Prețul de vânzare repararea istoricului de achiziții, care nu-și mai reîmprospăta niciodată cache-ul (ultima recepție lipsea), și mesaje de eroare umane pentru mentenanța/limitarea MoySklad (în loc de pagina HTML brută). Actualizarea anterioară (2026-10-02) adusese: persistența redesenată complet (produsele, comenzile și listele de preț au acum propriile tabele în Supabase, cu salvare pe bucăți — vezi secțiunea 5), o reparație critică la limitarea de rată MoySklad (care dezactivase temporar accesul API pentru tot contul), corectarea a două bug-uri grave la prețurile Secundar/Pachet 1-3 din Comenzi (reveneau silențios la valori vechi), protecție la pierderea modificărilor dintr-un refresh rapid (Ctrl+F5), sincronizare automată a catalogului MoySklad la pornire, afișarea stocului MoySklad direct în Comenzi, și corectări de căutare/redimensionare în Comparație produse. De asemenea: eticheta de rutină „sinecost: ..." eliminată din Comenzi, tabelele cu scroll (inclusiv tabelul de prețuri din Comenzi) care se extind acum dinamic pe măsură ce derulezi pagina, și lățimea maximă a aplicației mărită la 2000px.</w:t>
+        <w:t>Actualizat: 2026-10-06, cu detectarea produselor MoySklad duplicate și protecția împotriva scrierii prețurilor pe produsul greșit (importul/trimiterea de prețuri sar peste barcode-urile duplicate, iar tab-ul Produse MoySklad are un raport „Verifică duplicate"), sincronizarea automată a catalogului MoySklad înainte de fiecare import/trimitere de prețuri, și repararea butoanelor „Arhivate" / „Înapoi la branduri" / „Arhivate în acest brand" din Produse MoySklad, care nu făceau nimic, și repararea butonului „Deblochează câmpurile" din Comenzi, care readucea prețurile de vânzare vechi, plus afișarea în roșu a Secundarului când diferă de Prețul de vânzare repararea istoricului de achiziții, care nu-și mai reîmprospăta niciodată cache-ul (ultima recepție lipsea), și mesaje de eroare umane pentru mentenanța/limitarea MoySklad (în loc de pagina HTML brută) și „Trimite prețurile în MoySklad" care acum trimite doar produsele cu preț de vânzare modificat. Actualizarea anterioară (2026-10-02) adusese: persistența redesenată complet (produsele, comenzile și listele de preț au acum propriile tabele în Supabase, cu salvare pe bucăți — vezi secțiunea 5), o reparație critică la limitarea de rată MoySklad (care dezactivase temporar accesul API pentru tot contul), corectarea a două bug-uri grave la prețurile Secundar/Pachet 1-3 din Comenzi (reveneau silențios la valori vechi), protecție la pierderea modificărilor dintr-un refresh rapid (Ctrl+F5), sincronizare automată a catalogului MoySklad la pornire, afișarea stocului MoySklad direct în Comenzi, și corectări de căutare/redimensionare în Comparație produse. De asemenea: eticheta de rutină „sinecost: ..." eliminată din Comenzi, tabelele cu scroll (inclusiv tabelul de prețuri din Comenzi) care se extind acum dinamic pe măsură ce derulezi pagina, și lățimea maximă a aplicației mărită la 2000px.</w:t>
       </w:r>
     </w:p>
     <w:p>
@@ -1665,7 +1665,7 @@
         <w:pStyle w:val="ListBullet"/>
       </w:pPr>
       <w:r>
-        <w:t>„📤 Trimite prețurile în MoySklad" — scrie înapoi toate cele 7 câmpuri, cu o reîncercare automată pe fiecare eșec trecător (vezi secțiunea 6). Înainte de trimitere catalogul se sincronizează automat, iar dialogul de confirmare listează produsele sărite din cauza barcode-ului duplicat.</w:t>
+        <w:t>„📤 Trimite prețurile în MoySklad" — scrie în MoySklad DOAR produsele la care s-a schimbat un preț de vânzare (Preț, Secundar, Pachet 1/2/3) față de ce are MoySklad, și doar câmpurile care diferă (din cele 7: Sinecost, Achiziție $, Preț, Secundar, Pachet 1/2/3), cu o reîncercare automată pe fiecare eșec trecător (vezi secțiunea 6). Comparația e instantanee și fără cereri de rețea: se face cu instantaneul din msAttrsCache, citit în fundal la deschiderea comenzii. Înainte de trimitere catalogul se sincronizează automat, iar dialogul de confirmare listează modificările (ex: „Preț vânzare 345 → 399") și produsele sărite (barcode duplicat, nelegate, doar Sinecost diferit).</w:t>
       </w:r>
     </w:p>
     <w:p>
@@ -2232,6 +2232,14 @@
       </w:pPr>
       <w:r>
         <w:t>În mentenanța MoySklad („Технические работы", HTTP 503) toast-ul „Nu am putut sincroniza catalogul MoySklad" afișa tot codul HTML al paginii de mentenanță (Worker-ul pune corpul brut al răspunsului MoySklad în câmpul detail, învelit într-un 502 propriu). Helper nou, humanMsErrorInfo(raw, status) → {text, transient}: preferă codul din textul brut (statusul real MoySklad) celui primit; recunoaște mentenanța (503 sau cuvintele-cheie din pagină), limita de rată (429 / cod 1061), conexiunea picată (Failed to fetch) și orice pagină HTML (mesaj generic cu codul); trunchiază textele peste 200 de caractere. Aplicat la: sincronizarea catalogului (cu mențiunea „Lucrezi în continuare cu ultimul catalog salvat"), testul conexiunii din Setări (sfatul „verifică URL-ul și secretele" apare doar pentru erori non-trecătoare), primul mesaj de eroare de la „Trimite prețurile" și erorile de istoric de achiziții. Erorile TRECĂTOARE de istoric au acum retryAt (reîncercare după 10 minute) — înainte rămâneau „Eroare" până la reîncărcarea paginii. Toast-urile de eroare stau pe ecran proporțional cu lungimea mesajului (60 ms/caracter, între 3,8 și 12 secunde) — mesajele noi sunt mai lungi (motiv + ce să faci).</w:t>
+      </w:r>
+    </w:p>
+    <w:p>
+      <w:pPr>
+        <w:pStyle w:val="ListBullet"/>
+      </w:pPr>
+      <w:r>
+        <w:t>„Trimite prețurile în MoySklad" era lent chiar dacă modificai prețul la un singur produs: scria TOATE câmpurile TUTUROR produselor din comandă (câte o citire plus o scriere în MoySklad per produs, prin handleSetAttrs — la 76 de produse zeci de secunde de cereri), și suprascria în MoySklad și valori neatinse de utilizator. Acum planPushChanges(o, keys) compară, sincron, valorile dorite (buildPushAttrs: 7 câmpuri) cu instantaneul MoySklad din msAttrsCache (cu timestamp at) și include un produs în plan doar dacă îi diferă un câmp de PREȚ DE VÂNZARE (toleranță 0,005); atunci se trimit toate câmpurile lui care diferă. Produsele la care diferă doar Sinecost/Achiziție NU declanșează trimiterea — sunt derivate din comandă, nu „modificate" de utilizator (constanta MS_PUSH_COST_TRIGGERS = false; dacă se dorește ca sinecostul să se trimită pentru toate produsele din comandă, se pune true). Un produs fără instantaneu (citirea din fundal n-a reușit) nu poate fi comparat și se trimite complet, ca înainte. După o trimitere confirmată, instantaneul se actualizează cu valorile confirmate (a doua trimitere imediată nu rescrie nimic); la o valoare neconfirmată instantaneul se șterge, ca să fie citit din nou. Confirmarea listează modificările (maxim 8 produse) și arată câte produse sunt sărite. Limitare cunoscută, acceptată pentru viteză: instantaneul nu se reîmprospătează la trimitere — dacă cineva schimbă prețul direct în MoySklad după deschiderea comenzii, iar local ai aceeași valoare ca înainte, acel câmp nu se retrimite (se vede la „Importă prețuri").</w:t>
       </w:r>
     </w:p>
     <w:p>

</xml_diff>

<commit_message>
Documentație: prioritate pentru operațiile utilizatorului față de încărcările de fundal
Co-Authored-By: Claude Sonnet 5.5 <noreply@anthropic.com>
</commit_message>
<xml_diff>
--- a/Panou achizitii - documentatie tehnica.docx
+++ b/Panou achizitii - documentatie tehnica.docx
@@ -17,7 +17,7 @@
     </w:p>
     <w:p>
       <w:r>
-        <w:t>Actualizat: 2026-10-06, cu detectarea produselor MoySklad duplicate și protecția împotriva scrierii prețurilor pe produsul greșit (importul/trimiterea de prețuri sar peste barcode-urile duplicate, iar tab-ul Produse MoySklad are un raport „Verifică duplicate"), sincronizarea automată a catalogului MoySklad înainte de fiecare import/trimitere de prețuri, și repararea butoanelor „Arhivate" / „Înapoi la branduri" / „Arhivate în acest brand" din Produse MoySklad, care nu făceau nimic, și repararea butonului „Deblochează câmpurile" din Comenzi, care readucea prețurile de vânzare vechi, plus afișarea în roșu a Secundarului când diferă de Prețul de vânzare repararea istoricului de achiziții, care nu-și mai reîmprospăta niciodată cache-ul (ultima recepție lipsea), și mesaje de eroare umane pentru mentenanța/limitarea MoySklad (în loc de pagina HTML brută) și „Trimite prețurile în MoySklad" care acum trimite doar produsele cu preț de vânzare modificat. Actualizarea anterioară (2026-10-02) adusese: persistența redesenată complet (produsele, comenzile și listele de preț au acum propriile tabele în Supabase, cu salvare pe bucăți — vezi secțiunea 5), o reparație critică la limitarea de rată MoySklad (care dezactivase temporar accesul API pentru tot contul), corectarea a două bug-uri grave la prețurile Secundar/Pachet 1-3 din Comenzi (reveneau silențios la valori vechi), protecție la pierderea modificărilor dintr-un refresh rapid (Ctrl+F5), sincronizare automată a catalogului MoySklad la pornire, afișarea stocului MoySklad direct în Comenzi, și corectări de căutare/redimensionare în Comparație produse. De asemenea: eticheta de rutină „sinecost: ..." eliminată din Comenzi, tabelele cu scroll (inclusiv tabelul de prețuri din Comenzi) care se extind acum dinamic pe măsură ce derulezi pagina, și lățimea maximă a aplicației mărită la 2000px.</w:t>
+        <w:t>Actualizat: 2026-10-06, cu detectarea produselor MoySklad duplicate și protecția împotriva scrierii prețurilor pe produsul greșit (importul/trimiterea de prețuri sar peste barcode-urile duplicate, iar tab-ul Produse MoySklad are un raport „Verifică duplicate"), sincronizarea automată a catalogului MoySklad înainte de fiecare import/trimitere de prețuri, și repararea butoanelor „Arhivate" / „Înapoi la branduri" / „Arhivate în acest brand" din Produse MoySklad, care nu făceau nimic, și repararea butonului „Deblochează câmpurile" din Comenzi, care readucea prețurile de vânzare vechi, plus afișarea în roșu a Secundarului când diferă de Prețul de vânzare repararea istoricului de achiziții, care nu-și mai reîmprospăta niciodată cache-ul (ultima recepție lipsea), și mesaje de eroare umane pentru mentenanța/limitarea MoySklad (în loc de pagina HTML brută) și „Trimite prețurile în MoySklad" care acum trimite doar produsele cu preț de vânzare modificat, cu încărcările de fundal oprite cât timp trimiți. Actualizarea anterioară (2026-10-02) adusese: persistența redesenată complet (produsele, comenzile și listele de preț au acum propriile tabele în Supabase, cu salvare pe bucăți — vezi secțiunea 5), o reparație critică la limitarea de rată MoySklad (care dezactivase temporar accesul API pentru tot contul), corectarea a două bug-uri grave la prețurile Secundar/Pachet 1-3 din Comenzi (reveneau silențios la valori vechi), protecție la pierderea modificărilor dintr-un refresh rapid (Ctrl+F5), sincronizare automată a catalogului MoySklad la pornire, afișarea stocului MoySklad direct în Comenzi, și corectări de căutare/redimensionare în Comparație produse. De asemenea: eticheta de rutină „sinecost: ..." eliminată din Comenzi, tabelele cu scroll (inclusiv tabelul de prețuri din Comenzi) care se extind acum dinamic pe măsură ce derulezi pagina, și lățimea maximă a aplicației mărită la 2000px.</w:t>
       </w:r>
     </w:p>
     <w:p>
@@ -1088,7 +1088,7 @@
         <w:pStyle w:val="ListBullet"/>
       </w:pPr>
       <w:r>
-        <w:t>Sincronizează automat catalogul (ptSyncCatalog) dacă: (1) catalogul local lipsește sau nu a fost niciodată sincronizat; sau (2) e mai vechi de 1 oră (MS_PREP_MAX_CATALOG_AGE_MS); sau (3) comanda conține produse nelegate de MoySklad ȘI ultima sincronizare e mai veche de 2 minute (MS_PREP_RECHECK_UNLINKED_MS).</w:t>
+        <w:t>Sincronizează automat catalogul (ptSyncCatalog) dacă: (1) catalogul local lipsește sau nu a fost niciodată sincronizat; sau (2) e mai vechi de 6 ore (MS_PREP_MAX_CATALOG_AGE_MS; era 1 oră, redus ca frecvență fiindcă sincronizarea durează ~11 secunde și poate primi eroarea 1073 sub încărcare); sau (3) comanda conține produse nelegate de MoySklad ȘI ultima sincronizare e mai veche de 2 minute (MS_PREP_RECHECK_UNLINKED_MS).</w:t>
       </w:r>
     </w:p>
     <w:p>
@@ -1718,7 +1718,7 @@
         <w:pStyle w:val="ListBullet"/>
       </w:pPr>
       <w:r>
-        <w:t>Săgeata de lângă fiecare produs expandează istoricul de achiziții, încărcat la cerere. Istoricul se ține în cache local (localStorage) și se reîmprospătează automat în fundal după 30 de minute.</w:t>
+        <w:t>Săgeata de lângă fiecare produs expandează istoricul de achiziții, încărcat la cerere. Istoricul se ține în cache local (localStorage) și se reîmprospătează automat în fundal după 6 ore (HISTORY_MAX_AGE_MS) — sau după 5 minute când deschizi explicit un produs (HISTORY_EXPANDED_MAX_AGE_MS).</w:t>
       </w:r>
     </w:p>
     <w:p>
@@ -2223,7 +2223,15 @@
         <w:pStyle w:val="ListBullet"/>
       </w:pPr>
       <w:r>
-        <w:t>Ultima recepție (приемка) din MoySklad nu apărea niciodată în coloana „Istoric" / în istoricul de achiziții (raportat: recepția din 22.09.2026, 200 buc la 134,49, lipsea; se vedeau doar cele din aprilie și februarie). Worker-ul (ruta ?history=) returna corect recepția nouă — verificat direct pe URL-ul live. Cauza era în browser: catalogHistoryCache se salvează în localStorage (pt_history_cache_v1) și ensureHistoryLoaded ieșea imediat la ORICE intrare existentă, deci istoricul adus o singură dată nu se mai reîmprospăta niciodată. Reparat: fiecare intrare are fetchedAt și, după 30 de minute (HISTORY_MAX_AGE_MS), se reîmprospătează în fundal la următoarea afișare — istoricul vechi rămâne vizibil până sosește cel nou și rămâne și dacă reîmprospătarea eșuează (reîncercare după 10 minute, retryAt). Intrările vechi din localStorage, fără fetchedAt, se reîmprospătează o dată. Protecție la limita de rată: un răspuns 429 oprește 20 de secunde întreaga coadă de istoric (historyPausedUntil), cu maximum 3 reluări per produs (historyRetries); prima încărcare eșuată rămâne ca eroare în sesiune, ca înainte, ca să nu existe bucle de reîncercare la fiecare randare. Istoricul se aduce în continuare doar pentru produsele afișate într-o listă restrânsă (căutare sau brand ales), într-o comandă deschisă sau la expandarea unui produs.</w:t>
+        <w:t>Ultima recepție (приемка) din MoySklad nu apărea niciodată în coloana „Istoric" / în istoricul de achiziții (raportat: recepția din 22.09.2026, 200 buc la 134,49, lipsea; se vedeau doar cele din aprilie și februarie). Worker-ul (ruta ?history=) returna corect recepția nouă — verificat direct pe URL-ul live. Cauza era în browser: catalogHistoryCache se salvează în localStorage (pt_history_cache_v1) și ensureHistoryLoaded ieșea imediat la ORICE intrare existentă, deci istoricul adus o singură dată nu se mai reîmprospăta niciodată. Reparat: fiecare intrare are fetchedAt și, după 6 ore (HISTORY_MAX_AGE_MS; inițial 30 de minute, mărit după ce s-a văzut că reîmprospătarea în masă încarcă prea mult MoySklad — vezi bullet-ul următor) sau 5 minute pentru un produs deschis explicit (HISTORY_EXPANDED_MAX_AGE_MS), se reîmprospătează în fundal la următoarea afișare — istoricul vechi rămâne vizibil până sosește cel nou și rămâne și dacă reîmprospătarea eșuează (reîncercare după 10 minute, retryAt). Intrările vechi din localStorage, fără fetchedAt, se reîmprospătează o dată. Protecție la limita de rată: un răspuns 429 oprește 20 de secunde întreaga coadă de istoric (historyPausedUntil), cu maximum 3 reluări per produs (historyRetries); prima încărcare eșuată rămâne ca eroare în sesiune, ca înainte, ca să nu existe bucle de reîncercare la fiecare randare. Istoricul se aduce în continuare doar pentru produsele afișate într-o listă restrânsă (căutare sau brand ales), într-o comandă deschisă sau la expandarea unui produs.</w:t>
+      </w:r>
+    </w:p>
+    <w:p>
+      <w:pPr>
+        <w:pStyle w:val="ListBullet"/>
+      </w:pPr>
+      <w:r>
+        <w:t>„Trimite prețurile" părea blocat chiar și pentru un singur produs modificat. Măsurat direct pe Worker-ul live: o cerere de istoric durează 7–12 secunde (expand=positions pe 20 de recepții), iar MoySklad limitează cererile SIMULTANE per cont (eroarea 1073 „Превышено ограничение на одновременное количество запросов", cod 429; la sincronizarea catalogului, care folosește 3 cereri paralele, apărea intermitent ca 502). La deschiderea unei comenzi de 76 de produse porneau zeci de cereri de fundal (istoric cu 6 simultane, atribute 4, poze 4), care ocupau tot bugetul, iar trimiterea/importul/sincronizarea catalogului stăteau la coadă sau primeau 429. Reparat prin prioritate pentru operațiile utilizatorului: (1) cât timp rulează o operație (msPriceSyncBusy, msPrepareBusy sau catalogSyncing — msForegroundBusy()), cozile de fundal (pumpAttrsQueue, pumpImgQueue, pumpHistoryQueue) nu pornesc cereri noi și se reiau singure după o secundă de la sfârșitul operației (msBgWaiting); (2) plafon global de MS_BG_MAX_CONCURRENT = 4 cereri de fundal simultane (înainte până la 14), cu ordinea atribute → poze → istoric (msPumpAllBackground); (3) istoricul: HISTORY_CONCURRENCY 6 → 3. În plus, butonul „Trimite prețurile" arată „Se pregătește…" în faza de sincronizare a catalogului, butonul „Importă" nu mai rămâne gol cât timp e blocat (setMsSyncBtn păstrează eticheta), iar sincronizarea automată a catalogului înainte de trimitere/import se face la 6 ore, nu la 1 oră. Limitare: cererile de fundal deja pornite la momentul apăsării (maxim 4) se termină înainte să se elibereze bugetul, deci prima secundă-două pot fi încă lente.</w:t>
       </w:r>
     </w:p>
     <w:p>

</xml_diff>

<commit_message>
Documentație: comenzile recepționate la sfîrșitul listei, estompate
Co-Authored-By: Claude Sonnet 5.5 <noreply@anthropic.com>
</commit_message>
<xml_diff>
--- a/Panou achizitii - documentatie tehnica.docx
+++ b/Panou achizitii - documentatie tehnica.docx
@@ -17,7 +17,7 @@
     </w:p>
     <w:p>
       <w:r>
-        <w:t>Actualizat: 2026-10-06, cu detectarea produselor MoySklad duplicate și protecția împotriva scrierii prețurilor pe produsul greșit (importul/trimiterea de prețuri sar peste barcode-urile duplicate, iar tab-ul Produse MoySklad are un raport „Verifică duplicate"), sincronizarea automată a catalogului MoySklad înainte de fiecare import/trimitere de prețuri, și repararea butoanelor „Arhivate" / „Înapoi la branduri" / „Arhivate în acest brand" din Produse MoySklad, care nu făceau nimic, și repararea butonului „Deblochează câmpurile" din Comenzi, care readucea prețurile de vânzare vechi, plus afișarea în roșu a Secundarului când diferă de Prețul de vânzare repararea istoricului de achiziții, care nu-și mai reîmprospăta niciodată cache-ul (ultima recepție lipsea), și mesaje de eroare umane pentru mentenanța/limitarea MoySklad (în loc de pagina HTML brută) și „Trimite prețurile în MoySklad" care acum trimite doar produsele cu preț de vânzare modificat, cu încărcările de fundal oprite cât timp trimiți. Actualizarea anterioară (2026-10-02) adusese: persistența redesenată complet (produsele, comenzile și listele de preț au acum propriile tabele în Supabase, cu salvare pe bucăți — vezi secțiunea 5), o reparație critică la limitarea de rată MoySklad (care dezactivase temporar accesul API pentru tot contul), corectarea a două bug-uri grave la prețurile Secundar/Pachet 1-3 din Comenzi (reveneau silențios la valori vechi), protecție la pierderea modificărilor dintr-un refresh rapid (Ctrl+F5), sincronizare automată a catalogului MoySklad la pornire, afișarea stocului MoySklad direct în Comenzi, și corectări de căutare/redimensionare în Comparație produse. De asemenea: eticheta de rutină „sinecost: ..." eliminată din Comenzi, tabelele cu scroll (inclusiv tabelul de prețuri din Comenzi) care se extind acum dinamic pe măsură ce derulezi pagina, și lățimea maximă a aplicației mărită la 2000px.</w:t>
+        <w:t>Actualizat: 2026-10-06, cu detectarea produselor MoySklad duplicate și protecția împotriva scrierii prețurilor pe produsul greșit (importul/trimiterea de prețuri sar peste barcode-urile duplicate, iar tab-ul Produse MoySklad are un raport „Verifică duplicate"), sincronizarea automată a catalogului MoySklad înainte de fiecare import/trimitere de prețuri, și repararea butoanelor „Arhivate" / „Înapoi la branduri" / „Arhivate în acest brand" din Produse MoySklad, care nu făceau nimic, și repararea butonului „Deblochează câmpurile" din Comenzi, care readucea prețurile de vânzare vechi, plus afișarea în roșu a Secundarului când diferă de Prețul de vânzare repararea istoricului de achiziții, care nu-și mai reîmprospăta niciodată cache-ul (ultima recepție lipsea), și mesaje de eroare umane pentru mentenanța/limitarea MoySklad (în loc de pagina HTML brută) și „Trimite prețurile în MoySklad" care acum trimite doar produsele cu preț de vânzare modificat, cu încărcările de fundal oprite cât timp trimiți, și comenzile recepționate sortate la sfârșitul listei, estompate. Actualizarea anterioară (2026-10-02) adusese: persistența redesenată complet (produsele, comenzile și listele de preț au acum propriile tabele în Supabase, cu salvare pe bucăți — vezi secțiunea 5), o reparație critică la limitarea de rată MoySklad (care dezactivase temporar accesul API pentru tot contul), corectarea a două bug-uri grave la prețurile Secundar/Pachet 1-3 din Comenzi (reveneau silențios la valori vechi), protecție la pierderea modificărilor dintr-un refresh rapid (Ctrl+F5), sincronizare automată a catalogului MoySklad la pornire, afișarea stocului MoySklad direct în Comenzi, și corectări de căutare/redimensionare în Comparație produse. De asemenea: eticheta de rutină „sinecost: ..." eliminată din Comenzi, tabelele cu scroll (inclusiv tabelul de prețuri din Comenzi) care se extind acum dinamic pe măsură ce derulezi pagina, și lățimea maximă a aplicației mărită la 2000px.</w:t>
       </w:r>
     </w:p>
     <w:p>
@@ -2232,6 +2232,14 @@
       </w:pPr>
       <w:r>
         <w:t>„Trimite prețurile" părea blocat chiar și pentru un singur produs modificat. Măsurat direct pe Worker-ul live: o cerere de istoric durează 7–12 secunde (expand=positions pe 20 de recepții), iar MoySklad limitează cererile SIMULTANE per cont (eroarea 1073 „Превышено ограничение на одновременное количество запросов", cod 429; la sincronizarea catalogului, care folosește 3 cereri paralele, apărea intermitent ca 502). La deschiderea unei comenzi de 76 de produse porneau zeci de cereri de fundal (istoric cu 6 simultane, atribute 4, poze 4), care ocupau tot bugetul, iar trimiterea/importul/sincronizarea catalogului stăteau la coadă sau primeau 429. Reparat prin prioritate pentru operațiile utilizatorului: (1) cât timp rulează o operație (msPriceSyncBusy, msPrepareBusy sau catalogSyncing — msForegroundBusy()), cozile de fundal (pumpAttrsQueue, pumpImgQueue, pumpHistoryQueue) nu pornesc cereri noi și se reiau singure după o secundă de la sfârșitul operației (msBgWaiting); (2) plafon global de MS_BG_MAX_CONCURRENT = 4 cereri de fundal simultane (înainte până la 14), cu ordinea atribute → poze → istoric (msPumpAllBackground); (3) istoricul: HISTORY_CONCURRENCY 6 → 3. În plus, butonul „Trimite prețurile" arată „Se pregătește…" în faza de sincronizare a catalogului, butonul „Importă" nu mai rămâne gol cât timp e blocat (setMsSyncBtn păstrează eticheta), iar sincronizarea automată a catalogului înainte de trimitere/import se face la 6 ore, nu la 1 oră. Limitare: cererile de fundal deja pornite la momentul apăsării (maxim 4) se termină înainte să se elibereze bugetul, deci prima secundă-două pot fi încă lente.</w:t>
+      </w:r>
+    </w:p>
+    <w:p>
+      <w:pPr>
+        <w:pStyle w:val="ListBullet"/>
+      </w:pPr>
+      <w:r>
+        <w:t>Istoric comenzi (renderOrderHistory): comenzile cu status „received" sunt acum sortate automat la sfârșitul listei și estompate, ca documentele „fără provedenie" din MoySklad. Lista se împarte în pendingOrders (status diferit de „received") și receivedOrders, concatenate în această ordine (ordinea din interiorul fiecărui grup rămâne cea din state.orders); când există ambele grupuri se inserează un rând-separator „Recepționate · N" (clasa pt-orders-divider). Rândurile recepționate primesc clasa row-received (opacitate .55, 1 la hover sau când comanda e deschisă — regula CSS exclude .row-open). Sortarea se refă la fiecare randare, iar ptSetOrderStatus re-randează lista, deci o comandă marcată „Recepționată" (manual sau automat, după verificarea statusului în MoySklad) coboară singură. Doar prezentare: nicio schimbare de date și nicio cerere către MoySklad.</w:t>
       </w:r>
     </w:p>
     <w:p>

</xml_diff>

<commit_message>
Documentație: editorul de prețuri din Produse MoySklad
Co-Authored-By: Claude Sonnet 5.5 <noreply@anthropic.com>
</commit_message>
<xml_diff>
--- a/Panou achizitii - documentatie tehnica.docx
+++ b/Panou achizitii - documentatie tehnica.docx
@@ -17,7 +17,7 @@
     </w:p>
     <w:p>
       <w:r>
-        <w:t>Actualizat: 2026-10-06, cu detectarea produselor MoySklad duplicate și protecția împotriva scrierii prețurilor pe produsul greșit (importul/trimiterea de prețuri sar peste barcode-urile duplicate, iar tab-ul Produse MoySklad are un raport „Verifică duplicate"), sincronizarea automată a catalogului MoySklad înainte de fiecare import/trimitere de prețuri, și repararea butoanelor „Arhivate" / „Înapoi la branduri" / „Arhivate în acest brand" din Produse MoySklad, care nu făceau nimic, și repararea butonului „Deblochează câmpurile" din Comenzi, care readucea prețurile de vânzare vechi, plus afișarea în roșu a Secundarului când diferă de Prețul de vânzare repararea istoricului de achiziții, care nu-și mai reîmprospăta niciodată cache-ul (ultima recepție lipsea), și mesaje de eroare umane pentru mentenanța/limitarea MoySklad (în loc de pagina HTML brută) și „Trimite prețurile în MoySklad" care acum trimite doar produsele cu preț de vânzare modificat, cu încărcările de fundal oprite cât timp trimiți, și comenzile recepționate sortate la sfârșitul listei, estompate. Actualizarea anterioară (2026-10-02) adusese: persistența redesenată complet (produsele, comenzile și listele de preț au acum propriile tabele în Supabase, cu salvare pe bucăți — vezi secțiunea 5), o reparație critică la limitarea de rată MoySklad (care dezactivase temporar accesul API pentru tot contul), corectarea a două bug-uri grave la prețurile Secundar/Pachet 1-3 din Comenzi (reveneau silențios la valori vechi), protecție la pierderea modificărilor dintr-un refresh rapid (Ctrl+F5), sincronizare automată a catalogului MoySklad la pornire, afișarea stocului MoySklad direct în Comenzi, și corectări de căutare/redimensionare în Comparație produse. De asemenea: eticheta de rutină „sinecost: ..." eliminată din Comenzi, tabelele cu scroll (inclusiv tabelul de prețuri din Comenzi) care se extind acum dinamic pe măsură ce derulezi pagina, și lățimea maximă a aplicației mărită la 2000px.</w:t>
+        <w:t>Actualizat: 2026-10-06, cu detectarea produselor MoySklad duplicate și protecția împotriva scrierii prețurilor pe produsul greșit (importul/trimiterea de prețuri sar peste barcode-urile duplicate, iar tab-ul Produse MoySklad are un raport „Verifică duplicate"), sincronizarea automată a catalogului MoySklad înainte de fiecare import/trimitere de prețuri, și repararea butoanelor „Arhivate" / „Înapoi la branduri" / „Arhivate în acest brand" din Produse MoySklad, care nu făceau nimic, și repararea butonului „Deblochează câmpurile" din Comenzi, care readucea prețurile de vânzare vechi, plus afișarea în roșu a Secundarului când diferă de Prețul de vânzare repararea istoricului de achiziții, care nu-și mai reîmprospăta niciodată cache-ul (ultima recepție lipsea), și mesaje de eroare umane pentru mentenanța/limitarea MoySklad (în loc de pagina HTML brută) și „Trimite prețurile în MoySklad" care acum trimite doar produsele cu preț de vânzare modificat, cu încărcările de fundal oprite cât timp trimiți, și comenzile recepționate sortate la sfârșitul listei, estompate. Nou (2026-10-26): editorul de prețuri din Produse MoySklad, cu % și mesaj pentru magazin. Actualizarea anterioară (2026-10-02) adusese: persistența redesenată complet (produsele, comenzile și listele de preț au acum propriile tabele în Supabase, cu salvare pe bucăți — vezi secțiunea 5), o reparație critică la limitarea de rată MoySklad (care dezactivase temporar accesul API pentru tot contul), corectarea a două bug-uri grave la prețurile Secundar/Pachet 1-3 din Comenzi (reveneau silențios la valori vechi), protecție la pierderea modificărilor dintr-un refresh rapid (Ctrl+F5), sincronizare automată a catalogului MoySklad la pornire, afișarea stocului MoySklad direct în Comenzi, și corectări de căutare/redimensionare în Comparație produse. De asemenea: eticheta de rutină „sinecost: ..." eliminată din Comenzi, tabelele cu scroll (inclusiv tabelul de prețuri din Comenzi) care se extind acum dinamic pe măsură ce derulezi pagina, și lățimea maximă a aplicației mărită la 2000px.</w:t>
       </w:r>
     </w:p>
     <w:p>
@@ -1735,6 +1735,46 @@
       </w:pPr>
       <w:r>
         <w:t>Butonul „Verifică duplicate" (bara de sus, vizibil doar după ce există un catalog sincronizat) deschide raportul produselor MoySklad cu același barcode sau același cod — detaliile în secțiunea 6. Comutarea între vederile tab-ului (branduri / arhivate / duplicate) se face prin window.ptSetCatalogView(view) și window.ptBackToBrands(), starea fiind ținută în catalogShowHiddenBrands și catalogShowDuplicates.</w:t>
+      </w:r>
+    </w:p>
+    <w:p>
+      <w:pPr>
+        <w:pStyle w:val="ListBullet"/>
+      </w:pPr>
+      <w:r>
+        <w:t>Editorul de prețuri („💲 Prețuri", în vederea unui brand): tabel cu toate tipurile de preț ale produsului din MoySklad, citite prin ruta ?attrs= (PE_FIELDS în index.html): Achiziție $ („Pret furnizor in $"), Sinecost MDL (Закупочная цена), Preț de vânzare („Pret de Vinzare"), Preventiv (reduceri) (în Comenzi se numește „Secundar"), Beauty Expo, Magazin și Online, Pachet I/II/III. Tipul tehnic „-----" (neutilizat, valoare 0) e ascuns. Prețurile se citesc la intrarea în editor (cele citite acum mai mult de 5 minute — PE_SNAPSHOT_MAX_AGE_MS — se citesc din nou) prin coada de fundal existentă; maximum 100 de produse afișate odată (căutarea restrânge lista).</w:t>
+      </w:r>
+    </w:p>
+    <w:p>
+      <w:pPr>
+        <w:pStyle w:val="ListBullet"/>
+      </w:pPr>
+      <w:r>
+        <w:t>Tehnologia cu %: fiecare preț derivat are un procent de reducere față de Prețul de vânzare. Editezi prețul → se recalculează procentul (exact); editezi procentul (0–99,9) → se recalculează prețul; editezi Prețul de vânzare → toate prețurile derivate care au valoare își păstrează procentul și se recalculează (decizie explicită a proprietarului, inclusiv pentru „Magazin și Online"). Procentul inițial se deduce din prețurile din MoySklad (peDerivePct) și se „rotunjește" la un procent rotund (întreg sau .5) când acesta reproduce exact prețul după rotunjire (338 din 398 → 15%, nu 15,08%). Rotunjire: leu întreg pentru Preventiv, Beauty Expo și Magazin și Online (dacă valoarea inițială e întreagă sau necompletată), 2 zecimale pentru Pachete; cu epsilon (325 × 70% = 227,5 → 228). Un câmp readus la valoarea inițială iese din lista de modificări (peNormalize). Validare inline: număr valid, preț &gt; 0 (un câmp gol anulează modificarea), procent între 0 și 99,9; valoarea invalidă se respinge cu mesaj și câmpul revine.</w:t>
+      </w:r>
+    </w:p>
+    <w:p>
+      <w:pPr>
+        <w:pStyle w:val="ListBullet"/>
+      </w:pPr>
+      <w:r>
+        <w:t>Trimiterea: butonul „Trimite în MoySklad (N)" deschide o fereastră de revizuire (pePlan) cu lista modificărilor produs cu produs („Preț de vânzare 398 → 420") și avertismente: preț sub sinecost, preț derivat mai mare decât Prețul de vânzare, variație peste 50%. La confirmare se trimit DOAR câmpurile modificate, prin setAttrs (concurență 3, o reîncercare, verificarea valorilor confirmate de MoySklad). După succes: instantaneul din msAttrsCache se actualizează, modificarea iese din tabel, iar produsul intră în jurnalul de audit; produsele eșuate rămân în tabel cu motivul afișat. Cât timp se trimite, încărcările de fundal sunt oprite (msPriceSyncBusy) și butoanele blocate. Modificările netrimise stau doar în memorie (peEdits); beforeunload avertizează dacă există.</w:t>
+      </w:r>
+    </w:p>
+    <w:p>
+      <w:pPr>
+        <w:pStyle w:val="ListBullet"/>
+      </w:pPr>
+      <w:r>
+        <w:t>Mesajul pentru magazin: dacă s-a schimbat Prețul de vânzare sau „Magazin și Online" (prețul cu reducere online/magazine), se pregătește un mesaj standard (peStoreMessage) cu produsele modificate, ex: „Preț de vânzare modificat în: 325 / Preț cu reducere: 289" („Preț cu reducere" = Magazin și Online; dacă nu e completat, e egal cu Prețul de vânzare; dacă s-a schimbat doar prețul cu reducere: „Preț cu reducere modificat în: …"). Mesajul apare în fereastra de revizuire (editabil) și, definitiv, după trimitere, doar pentru produsele trimise cu succes; are buton de copiere, iar ultimul mesaj rămâne în localStorage (pt_last_store_message_v1) și poate fi redeschis din „📋 Ultimul mesaj". Nu se trimite automat nicăieri — se copiază și se lipește în grupul magazinelor.</w:t>
+      </w:r>
+    </w:p>
+    <w:p>
+      <w:pPr>
+        <w:pStyle w:val="ListBullet"/>
+      </w:pPr>
+      <w:r>
+        <w:t>Jurnal de audit: fiecare câmp trimis cu succes se adaugă în state.settings.priceChangeLog (data, utilizatorul, produsul, câmpul, era → acum), maximum 300 de înregistrări (PE_LOG_MAX), salvat prin mecanismul obișnuit (rândul „core" din app_state — fără schimbări de schemă). Vizibil în fereastra „🕘 Istoric". În worker.js, handleSetAttrs validează acum și pe server fiecare valoare (număr finit între 0 și 10.000.000) — necesită redeploy manual al Worker-ului în Cloudflare (până atunci protecția e doar în browser). Limitare: fără rezolvarea conflictelor — dacă cineva schimbă același preț direct în MoySklad după ce ai deschis editorul, valoarea ta o suprascrie la trimitere.</w:t>
       </w:r>
     </w:p>
     <w:p>

</xml_diff>

<commit_message>
Documentație: editorul de prețuri integrat în lista de produse (fără buton separat)
Co-Authored-By: Claude Sonnet 5.5 <noreply@anthropic.com>
</commit_message>
<xml_diff>
--- a/Panou achizitii - documentatie tehnica.docx
+++ b/Panou achizitii - documentatie tehnica.docx
@@ -17,7 +17,7 @@
     </w:p>
     <w:p>
       <w:r>
-        <w:t>Actualizat: 2026-10-06, cu detectarea produselor MoySklad duplicate și protecția împotriva scrierii prețurilor pe produsul greșit (importul/trimiterea de prețuri sar peste barcode-urile duplicate, iar tab-ul Produse MoySklad are un raport „Verifică duplicate"), sincronizarea automată a catalogului MoySklad înainte de fiecare import/trimitere de prețuri, și repararea butoanelor „Arhivate" / „Înapoi la branduri" / „Arhivate în acest brand" din Produse MoySklad, care nu făceau nimic, și repararea butonului „Deblochează câmpurile" din Comenzi, care readucea prețurile de vânzare vechi, plus afișarea în roșu a Secundarului când diferă de Prețul de vânzare repararea istoricului de achiziții, care nu-și mai reîmprospăta niciodată cache-ul (ultima recepție lipsea), și mesaje de eroare umane pentru mentenanța/limitarea MoySklad (în loc de pagina HTML brută) și „Trimite prețurile în MoySklad" care acum trimite doar produsele cu preț de vânzare modificat, cu încărcările de fundal oprite cât timp trimiți, și comenzile recepționate sortate la sfârșitul listei, estompate. Nou (2026-10-26): editorul de prețuri din Produse MoySklad, cu % și mesaj pentru magazin. Actualizarea anterioară (2026-10-02) adusese: persistența redesenată complet (produsele, comenzile și listele de preț au acum propriile tabele în Supabase, cu salvare pe bucăți — vezi secțiunea 5), o reparație critică la limitarea de rată MoySklad (care dezactivase temporar accesul API pentru tot contul), corectarea a două bug-uri grave la prețurile Secundar/Pachet 1-3 din Comenzi (reveneau silențios la valori vechi), protecție la pierderea modificărilor dintr-un refresh rapid (Ctrl+F5), sincronizare automată a catalogului MoySklad la pornire, afișarea stocului MoySklad direct în Comenzi, și corectări de căutare/redimensionare în Comparație produse. De asemenea: eticheta de rutină „sinecost: ..." eliminată din Comenzi, tabelele cu scroll (inclusiv tabelul de prețuri din Comenzi) care se extind acum dinamic pe măsură ce derulezi pagina, și lățimea maximă a aplicației mărită la 2000px.</w:t>
+        <w:t>Actualizat: 2026-10-06, cu detectarea produselor MoySklad duplicate și protecția împotriva scrierii prețurilor pe produsul greșit (importul/trimiterea de prețuri sar peste barcode-urile duplicate, iar tab-ul Produse MoySklad are un raport „Verifică duplicate"), sincronizarea automată a catalogului MoySklad înainte de fiecare import/trimitere de prețuri, și repararea butoanelor „Arhivate" / „Înapoi la branduri" / „Arhivate în acest brand" din Produse MoySklad, care nu făceau nimic, și repararea butonului „Deblochează câmpurile" din Comenzi, care readucea prețurile de vânzare vechi, plus afișarea în roșu a Secundarului când diferă de Prețul de vânzare repararea istoricului de achiziții, care nu-și mai reîmprospăta niciodată cache-ul (ultima recepție lipsea), și mesaje de eroare umane pentru mentenanța/limitarea MoySklad (în loc de pagina HTML brută) și „Trimite prețurile în MoySklad" care acum trimite doar produsele cu preț de vânzare modificat, cu încărcările de fundal oprite cât timp trimiți, și comenzile recepționate sortate la sfârșitul listei, estompate. Nou (2026-10-26): editorul de prețuri din Produse MoySklad, integrat direct în lista de produse (cu poze), cu % și mesaj pentru magazin. Actualizarea anterioară (2026-10-02) adusese: persistența redesenată complet (produsele, comenzile și listele de preț au acum propriile tabele în Supabase, cu salvare pe bucăți — vezi secțiunea 5), o reparație critică la limitarea de rată MoySklad (care dezactivase temporar accesul API pentru tot contul), corectarea a două bug-uri grave la prețurile Secundar/Pachet 1-3 din Comenzi (reveneau silențios la valori vechi), protecție la pierderea modificărilor dintr-un refresh rapid (Ctrl+F5), sincronizare automată a catalogului MoySklad la pornire, afișarea stocului MoySklad direct în Comenzi, și corectări de căutare/redimensionare în Comparație produse. De asemenea: eticheta de rutină „sinecost: ..." eliminată din Comenzi, tabelele cu scroll (inclusiv tabelul de prețuri din Comenzi) care se extind acum dinamic pe măsură ce derulezi pagina, și lățimea maximă a aplicației mărită la 2000px.</w:t>
       </w:r>
     </w:p>
     <w:p>
@@ -1742,7 +1742,7 @@
         <w:pStyle w:val="ListBullet"/>
       </w:pPr>
       <w:r>
-        <w:t>Editorul de prețuri („💲 Prețuri", în vederea unui brand): tabel cu toate tipurile de preț ale produsului din MoySklad, citite prin ruta ?attrs= (PE_FIELDS în index.html): Achiziție $ („Pret furnizor in $"), Sinecost MDL (Закупочная цена), Preț de vânzare („Pret de Vinzare"), Preventiv (reduceri) (în Comenzi se numește „Secundar"), Beauty Expo, Magazin și Online, Pachet I/II/III. Tipul tehnic „-----" (neutilizat, valoare 0) e ascuns. Prețurile se citesc la intrarea în editor (cele citite acum mai mult de 5 minute — PE_SNAPSHOT_MAX_AGE_MS — se citesc din nou) prin coada de fundal existentă; maximum 100 de produse afișate odată (căutarea restrânge lista).</w:t>
+        <w:t>Editorul de prețuri e integrat direct în lista de produse a unui brand (nu există un mod separat): fiecare rând are, lângă poză (44 px), numele și stocul, două câmpuri editabile — Preț de vânzare și Magazin și Online (cu %) — iar deschiderea produsului cu ▸ arată restul prețurilor (Achiziție $, Sinecost MDL, Preventiv, Beauty Expo, Pachet I/II/III, fiecare cu %) și istoricul de achiziții. Prețurile din MoySklad se citesc prin ruta ?attrs= (PE_FIELDS în index.html): „Pret furnizor in $", Закупочная цена, „Pret de Vinzare", „Preț Preventiv (reduceri)" (în Comenzi se numește „Secundar"), „Pret Beauty Expo", „Preț Magazin si Online", Pachet I/II/III; tipul „-----" (neutilizat) e ascuns. Citirea e leneșă: primele 12 rânduri se încarcă imediat, restul când apar pe ecran (IntersectionObserver, peObserveRows/peMaybeLoad), nu tot brandul deodată; prețurile citite acum mai mult de 5 minute (PE_SNAPSHOT_MAX_AGE_MS) se citesc din nou la intrarea în brand. Lista afișează maximum 100 de produse (căutarea restrânge). Cât timp un câmp din tab-ul Produse MoySklad e în curs de editare, re-randările de fundal sunt amânate.</w:t>
       </w:r>
     </w:p>
     <w:p>

</xml_diff>